<commit_message>
FINAL-DIA1: docs(week1): ejercicio final del día 1 y 5 ideas de práctica
- Plantilla del ejercicio "tu propia llamada a un LLM desde cero"
  documentada paso a paso (system_prompt, user_prompt, messages,
  llamada, print)
- 5 ideas de desafío investigadas: asunto de emails, análisis de
  sentimiento, resumen "explícamelo como si tuviera 5 años",
  clasificador de tickets de soporte, traductor con tono
- Balance de cierre del día 1 según el profesor
</commit_message>
<xml_diff>
--- a/AI-Engineer Core Track.docx
+++ b/AI-Engineer Core Track.docx
@@ -407,7 +407,29 @@
           <w:szCs w:val="24"/>
           <w:highlight w:val="yellow"/>
         </w:rPr>
-        <w:t>: Ollama: Ejecutar Modelos de IA en local</w:t>
+        <w:t xml:space="preserve">: </w:t>
+      </w:r>
+      <w:r>
+        <w:rPr>
+          <w:rFonts w:ascii="Arial" w:hAnsi="Arial" w:cs="Arial"/>
+          <w:b/>
+          <w:bCs/>
+          <w:sz w:val="24"/>
+          <w:szCs w:val="24"/>
+          <w:highlight w:val="yellow"/>
+        </w:rPr>
+        <w:t xml:space="preserve">DIA-1: </w:t>
+      </w:r>
+      <w:r>
+        <w:rPr>
+          <w:rFonts w:ascii="Arial" w:hAnsi="Arial" w:cs="Arial"/>
+          <w:b/>
+          <w:bCs/>
+          <w:sz w:val="24"/>
+          <w:szCs w:val="24"/>
+          <w:highlight w:val="yellow"/>
+        </w:rPr>
+        <w:t>Ollama: Ejecutar Modelos de IA en local</w:t>
       </w:r>
     </w:p>
     <w:p>
@@ -4881,7 +4903,62 @@
           <w:highlight w:val="yellow"/>
         </w:rPr>
         <w:lastRenderedPageBreak/>
-        <w:t xml:space="preserve">1.2: </w:t>
+        <w:t>1.2:</w:t>
+      </w:r>
+      <w:r>
+        <w:rPr>
+          <w:rFonts w:ascii="Arial" w:hAnsi="Arial" w:cs="Arial"/>
+          <w:b/>
+          <w:bCs/>
+          <w:sz w:val="24"/>
+          <w:szCs w:val="24"/>
+          <w:highlight w:val="yellow"/>
+        </w:rPr>
+        <w:t xml:space="preserve"> </w:t>
+      </w:r>
+      <w:r>
+        <w:rPr>
+          <w:rFonts w:ascii="Arial" w:hAnsi="Arial" w:cs="Arial"/>
+          <w:b/>
+          <w:bCs/>
+          <w:sz w:val="24"/>
+          <w:szCs w:val="24"/>
+          <w:highlight w:val="yellow"/>
+        </w:rPr>
+        <w:t>DIA-</w:t>
+      </w:r>
+      <w:r>
+        <w:rPr>
+          <w:rFonts w:ascii="Arial" w:hAnsi="Arial" w:cs="Arial"/>
+          <w:b/>
+          <w:bCs/>
+          <w:sz w:val="24"/>
+          <w:szCs w:val="24"/>
+          <w:highlight w:val="yellow"/>
+        </w:rPr>
+        <w:t>1</w:t>
+      </w:r>
+      <w:r>
+        <w:rPr>
+          <w:rFonts w:ascii="Arial" w:hAnsi="Arial" w:cs="Arial"/>
+          <w:b/>
+          <w:bCs/>
+          <w:sz w:val="24"/>
+          <w:szCs w:val="24"/>
+          <w:highlight w:val="yellow"/>
+        </w:rPr>
+        <w:t xml:space="preserve">: </w:t>
+      </w:r>
+      <w:r>
+        <w:rPr>
+          <w:rFonts w:ascii="Arial" w:hAnsi="Arial" w:cs="Arial"/>
+          <w:b/>
+          <w:bCs/>
+          <w:sz w:val="24"/>
+          <w:szCs w:val="24"/>
+          <w:highlight w:val="yellow"/>
+        </w:rPr>
+        <w:t xml:space="preserve"> </w:t>
       </w:r>
       <w:proofErr w:type="spellStart"/>
       <w:r>
@@ -7528,6 +7605,50 @@
         </w:rPr>
         <w:lastRenderedPageBreak/>
         <w:t>1.3</w:t>
+      </w:r>
+      <w:r>
+        <w:rPr>
+          <w:rFonts w:ascii="Arial" w:hAnsi="Arial" w:cs="Arial"/>
+          <w:b/>
+          <w:bCs/>
+          <w:sz w:val="24"/>
+          <w:szCs w:val="24"/>
+          <w:highlight w:val="yellow"/>
+        </w:rPr>
+        <w:t xml:space="preserve"> </w:t>
+      </w:r>
+      <w:r>
+        <w:rPr>
+          <w:rFonts w:ascii="Arial" w:hAnsi="Arial" w:cs="Arial"/>
+          <w:b/>
+          <w:bCs/>
+          <w:sz w:val="24"/>
+          <w:szCs w:val="24"/>
+          <w:highlight w:val="yellow"/>
+        </w:rPr>
+        <w:t>DIA-</w:t>
+      </w:r>
+      <w:r>
+        <w:rPr>
+          <w:rFonts w:ascii="Arial" w:hAnsi="Arial" w:cs="Arial"/>
+          <w:b/>
+          <w:bCs/>
+          <w:sz w:val="24"/>
+          <w:szCs w:val="24"/>
+          <w:highlight w:val="yellow"/>
+        </w:rPr>
+        <w:t>1</w:t>
+      </w:r>
+      <w:r>
+        <w:rPr>
+          <w:rFonts w:ascii="Arial" w:hAnsi="Arial" w:cs="Arial"/>
+          <w:b/>
+          <w:bCs/>
+          <w:sz w:val="24"/>
+          <w:szCs w:val="24"/>
+          <w:highlight w:val="yellow"/>
+        </w:rPr>
+        <w:t>:</w:t>
       </w:r>
       <w:r>
         <w:rPr>
@@ -9283,6 +9404,50 @@
           <w:highlight w:val="yellow"/>
         </w:rPr>
         <w:lastRenderedPageBreak/>
+        <w:t xml:space="preserve"> </w:t>
+      </w:r>
+      <w:r>
+        <w:rPr>
+          <w:rFonts w:ascii="Arial" w:hAnsi="Arial" w:cs="Arial"/>
+          <w:b/>
+          <w:bCs/>
+          <w:sz w:val="24"/>
+          <w:szCs w:val="24"/>
+          <w:highlight w:val="yellow"/>
+        </w:rPr>
+        <w:t>DIA-</w:t>
+      </w:r>
+      <w:r>
+        <w:rPr>
+          <w:rFonts w:ascii="Arial" w:hAnsi="Arial" w:cs="Arial"/>
+          <w:b/>
+          <w:bCs/>
+          <w:sz w:val="24"/>
+          <w:szCs w:val="24"/>
+          <w:highlight w:val="yellow"/>
+        </w:rPr>
+        <w:t>1</w:t>
+      </w:r>
+      <w:r>
+        <w:rPr>
+          <w:rFonts w:ascii="Arial" w:hAnsi="Arial" w:cs="Arial"/>
+          <w:b/>
+          <w:bCs/>
+          <w:sz w:val="24"/>
+          <w:szCs w:val="24"/>
+          <w:highlight w:val="yellow"/>
+        </w:rPr>
+        <w:t xml:space="preserve">: </w:t>
+      </w:r>
+      <w:r>
+        <w:rPr>
+          <w:rFonts w:ascii="Arial" w:hAnsi="Arial" w:cs="Arial"/>
+          <w:b/>
+          <w:bCs/>
+          <w:sz w:val="24"/>
+          <w:szCs w:val="24"/>
+          <w:highlight w:val="yellow"/>
+        </w:rPr>
         <w:t xml:space="preserve">Entorno desarrollo, notebooks </w:t>
       </w:r>
       <w:proofErr w:type="spellStart"/>
@@ -18766,68 +18931,64 @@
           <w:highlight w:val="yellow"/>
         </w:rPr>
         <w:lastRenderedPageBreak/>
-        <w:t>1.5 Completando el laboratorio (versión Gemini)</w:t>
-      </w:r>
-    </w:p>
-    <w:p>
-      <w:pPr>
-        <w:pStyle w:val="Ttulo3"/>
-        <w:rPr>
-          <w:rFonts w:cs="Arial"/>
-          <w:b/>
-          <w:bCs/>
-          <w:sz w:val="24"/>
-          <w:szCs w:val="24"/>
-        </w:rPr>
-      </w:pPr>
-      <w:r>
-        <w:rPr>
-          <w:rFonts w:cs="Arial"/>
+        <w:t xml:space="preserve">1.5 </w:t>
+      </w:r>
+      <w:r>
+        <w:rPr>
+          <w:rFonts w:ascii="Arial" w:hAnsi="Arial" w:cs="Arial"/>
           <w:b/>
           <w:bCs/>
           <w:sz w:val="24"/>
           <w:szCs w:val="24"/>
           <w:highlight w:val="yellow"/>
         </w:rPr>
-        <w:t xml:space="preserve">1.5.1 La función </w:t>
-      </w:r>
-      <w:proofErr w:type="spellStart"/>
-      <w:r>
-        <w:rPr>
-          <w:rFonts w:cs="Arial"/>
+        <w:t>DIA-</w:t>
+      </w:r>
+      <w:r>
+        <w:rPr>
+          <w:rFonts w:ascii="Arial" w:hAnsi="Arial" w:cs="Arial"/>
           <w:b/>
           <w:bCs/>
           <w:sz w:val="24"/>
           <w:szCs w:val="24"/>
           <w:highlight w:val="yellow"/>
         </w:rPr>
-        <w:t>messages_</w:t>
-      </w:r>
-      <w:proofErr w:type="gramStart"/>
-      <w:r>
-        <w:rPr>
-          <w:rFonts w:cs="Arial"/>
+        <w:t>1</w:t>
+      </w:r>
+      <w:r>
+        <w:rPr>
+          <w:rFonts w:ascii="Arial" w:hAnsi="Arial" w:cs="Arial"/>
           <w:b/>
           <w:bCs/>
           <w:sz w:val="24"/>
           <w:szCs w:val="24"/>
           <w:highlight w:val="yellow"/>
         </w:rPr>
-        <w:t>for</w:t>
-      </w:r>
-      <w:proofErr w:type="spellEnd"/>
-      <w:r>
-        <w:rPr>
-          <w:rFonts w:cs="Arial"/>
+        <w:t xml:space="preserve">: </w:t>
+      </w:r>
+      <w:r>
+        <w:rPr>
+          <w:rFonts w:ascii="Arial" w:hAnsi="Arial" w:cs="Arial"/>
           <w:b/>
           <w:bCs/>
           <w:sz w:val="24"/>
           <w:szCs w:val="24"/>
           <w:highlight w:val="yellow"/>
         </w:rPr>
-        <w:t>(</w:t>
-      </w:r>
-      <w:proofErr w:type="gramEnd"/>
+        <w:t>Completando el laboratorio (versión Gemini)</w:t>
+      </w:r>
+    </w:p>
+    <w:p>
+      <w:pPr>
+        <w:pStyle w:val="Ttulo3"/>
+        <w:rPr>
+          <w:rFonts w:cs="Arial"/>
+          <w:b/>
+          <w:bCs/>
+          <w:sz w:val="24"/>
+          <w:szCs w:val="24"/>
+        </w:rPr>
+      </w:pPr>
       <w:r>
         <w:rPr>
           <w:rFonts w:cs="Arial"/>
@@ -18837,8 +18998,9 @@
           <w:szCs w:val="24"/>
           <w:highlight w:val="yellow"/>
         </w:rPr>
-        <w:t>)</w:t>
-      </w:r>
+        <w:t xml:space="preserve">1.5.1 La función </w:t>
+      </w:r>
+      <w:proofErr w:type="spellStart"/>
       <w:r>
         <w:rPr>
           <w:rFonts w:cs="Arial"/>
@@ -18848,9 +19010,9 @@
           <w:szCs w:val="24"/>
           <w:highlight w:val="yellow"/>
         </w:rPr>
-        <w:t xml:space="preserve"> + </w:t>
-      </w:r>
-      <w:proofErr w:type="spellStart"/>
+        <w:t>messages_</w:t>
+      </w:r>
+      <w:proofErr w:type="gramStart"/>
       <w:r>
         <w:rPr>
           <w:rFonts w:cs="Arial"/>
@@ -18860,7 +19022,7 @@
           <w:szCs w:val="24"/>
           <w:highlight w:val="yellow"/>
         </w:rPr>
-        <w:t>summarize</w:t>
+        <w:t>for</w:t>
       </w:r>
       <w:proofErr w:type="spellEnd"/>
       <w:r>
@@ -18874,7 +19036,7 @@
         </w:rPr>
         <w:t>(</w:t>
       </w:r>
-      <w:proofErr w:type="spellStart"/>
+      <w:proofErr w:type="gramEnd"/>
       <w:r>
         <w:rPr>
           <w:rFonts w:cs="Arial"/>
@@ -18884,9 +19046,8 @@
           <w:szCs w:val="24"/>
           <w:highlight w:val="yellow"/>
         </w:rPr>
-        <w:t>url</w:t>
-      </w:r>
-      <w:proofErr w:type="spellEnd"/>
+        <w:t>)</w:t>
+      </w:r>
       <w:r>
         <w:rPr>
           <w:rFonts w:cs="Arial"/>
@@ -18896,6 +19057,54 @@
           <w:szCs w:val="24"/>
           <w:highlight w:val="yellow"/>
         </w:rPr>
+        <w:t xml:space="preserve"> + </w:t>
+      </w:r>
+      <w:proofErr w:type="spellStart"/>
+      <w:r>
+        <w:rPr>
+          <w:rFonts w:cs="Arial"/>
+          <w:b/>
+          <w:bCs/>
+          <w:sz w:val="24"/>
+          <w:szCs w:val="24"/>
+          <w:highlight w:val="yellow"/>
+        </w:rPr>
+        <w:t>summarize</w:t>
+      </w:r>
+      <w:proofErr w:type="spellEnd"/>
+      <w:r>
+        <w:rPr>
+          <w:rFonts w:cs="Arial"/>
+          <w:b/>
+          <w:bCs/>
+          <w:sz w:val="24"/>
+          <w:szCs w:val="24"/>
+          <w:highlight w:val="yellow"/>
+        </w:rPr>
+        <w:t>(</w:t>
+      </w:r>
+      <w:proofErr w:type="spellStart"/>
+      <w:r>
+        <w:rPr>
+          <w:rFonts w:cs="Arial"/>
+          <w:b/>
+          <w:bCs/>
+          <w:sz w:val="24"/>
+          <w:szCs w:val="24"/>
+          <w:highlight w:val="yellow"/>
+        </w:rPr>
+        <w:t>url</w:t>
+      </w:r>
+      <w:proofErr w:type="spellEnd"/>
+      <w:r>
+        <w:rPr>
+          <w:rFonts w:cs="Arial"/>
+          <w:b/>
+          <w:bCs/>
+          <w:sz w:val="24"/>
+          <w:szCs w:val="24"/>
+          <w:highlight w:val="yellow"/>
+        </w:rPr>
         <w:t>) — uniendo todas las piezas</w:t>
       </w:r>
     </w:p>
@@ -18944,6 +19153,9 @@
     </w:p>
     <w:p>
       <w:r>
+        <w:rPr>
+          <w:noProof/>
+        </w:rPr>
         <w:drawing>
           <wp:inline distT="0" distB="0" distL="0" distR="0" wp14:anchorId="6C0A03F9" wp14:editId="7CBFA506">
             <wp:extent cx="3676650" cy="1015162"/>
@@ -18989,6 +19201,9 @@
         </w:drawing>
       </w:r>
       <w:r>
+        <w:rPr>
+          <w:noProof/>
+        </w:rPr>
         <w:drawing>
           <wp:inline distT="0" distB="0" distL="0" distR="0" wp14:anchorId="55EA324D" wp14:editId="68985F37">
             <wp:extent cx="2647950" cy="1001240"/>
@@ -19034,6 +19249,9 @@
         </w:drawing>
       </w:r>
       <w:r>
+        <w:rPr>
+          <w:noProof/>
+        </w:rPr>
         <w:drawing>
           <wp:inline distT="0" distB="0" distL="0" distR="0" wp14:anchorId="1B2D9020" wp14:editId="0C181337">
             <wp:extent cx="4572000" cy="785374"/>
@@ -19079,6 +19297,9 @@
         </w:drawing>
       </w:r>
       <w:r>
+        <w:rPr>
+          <w:noProof/>
+        </w:rPr>
         <w:drawing>
           <wp:inline distT="0" distB="0" distL="0" distR="0" wp14:anchorId="41254208" wp14:editId="520EA7DB">
             <wp:extent cx="2934389" cy="1154430"/>
@@ -19201,6 +19422,9 @@
     </w:p>
     <w:p>
       <w:r>
+        <w:rPr>
+          <w:noProof/>
+        </w:rPr>
         <w:drawing>
           <wp:inline distT="0" distB="0" distL="0" distR="0" wp14:anchorId="4ED2D757" wp14:editId="2578B0E8">
             <wp:extent cx="3733800" cy="1528800"/>
@@ -19761,8 +19985,9 @@
           <w:szCs w:val="24"/>
           <w:highlight w:val="yellow"/>
         </w:rPr>
-        <w:t>1.5.</w:t>
-      </w:r>
+        <w:t xml:space="preserve">1.5.2 </w:t>
+      </w:r>
+      <w:proofErr w:type="spellStart"/>
       <w:r>
         <w:rPr>
           <w:rFonts w:cs="Arial"/>
@@ -19772,9 +19997,9 @@
           <w:szCs w:val="24"/>
           <w:highlight w:val="yellow"/>
         </w:rPr>
-        <w:t xml:space="preserve">2 </w:t>
-      </w:r>
-      <w:proofErr w:type="spellStart"/>
+        <w:t>display_summary</w:t>
+      </w:r>
+      <w:proofErr w:type="spellEnd"/>
       <w:r>
         <w:rPr>
           <w:rFonts w:cs="Arial"/>
@@ -19784,9 +20009,9 @@
           <w:szCs w:val="24"/>
           <w:highlight w:val="yellow"/>
         </w:rPr>
-        <w:t>display_summary</w:t>
-      </w:r>
-      <w:proofErr w:type="spellEnd"/>
+        <w:t>(</w:t>
+      </w:r>
+      <w:proofErr w:type="spellStart"/>
       <w:r>
         <w:rPr>
           <w:rFonts w:cs="Arial"/>
@@ -19796,9 +20021,9 @@
           <w:szCs w:val="24"/>
           <w:highlight w:val="yellow"/>
         </w:rPr>
-        <w:t>(</w:t>
-      </w:r>
-      <w:proofErr w:type="spellStart"/>
+        <w:t>url</w:t>
+      </w:r>
+      <w:proofErr w:type="spellEnd"/>
       <w:r>
         <w:rPr>
           <w:rFonts w:cs="Arial"/>
@@ -19808,9 +20033,9 @@
           <w:szCs w:val="24"/>
           <w:highlight w:val="yellow"/>
         </w:rPr>
-        <w:t>url</w:t>
-      </w:r>
-      <w:proofErr w:type="spellEnd"/>
+        <w:t xml:space="preserve">) – </w:t>
+      </w:r>
+      <w:proofErr w:type="spellStart"/>
       <w:r>
         <w:rPr>
           <w:rFonts w:cs="Arial"/>
@@ -19820,9 +20045,9 @@
           <w:szCs w:val="24"/>
           <w:highlight w:val="yellow"/>
         </w:rPr>
-        <w:t xml:space="preserve">) – </w:t>
-      </w:r>
-      <w:proofErr w:type="spellStart"/>
+        <w:t>mostarlo</w:t>
+      </w:r>
+      <w:proofErr w:type="spellEnd"/>
       <w:r>
         <w:rPr>
           <w:rFonts w:cs="Arial"/>
@@ -19832,23 +20057,14 @@
           <w:szCs w:val="24"/>
           <w:highlight w:val="yellow"/>
         </w:rPr>
-        <w:t>mostarlo</w:t>
-      </w:r>
-      <w:proofErr w:type="spellEnd"/>
-      <w:r>
-        <w:rPr>
-          <w:rFonts w:cs="Arial"/>
-          <w:b/>
-          <w:bCs/>
-          <w:sz w:val="24"/>
-          <w:szCs w:val="24"/>
-          <w:highlight w:val="yellow"/>
-        </w:rPr>
         <w:t xml:space="preserve"> formateado</w:t>
       </w:r>
     </w:p>
     <w:p>
       <w:r>
+        <w:rPr>
+          <w:noProof/>
+        </w:rPr>
         <w:drawing>
           <wp:inline distT="0" distB="0" distL="0" distR="0" wp14:anchorId="7B81BC35" wp14:editId="0D751AF9">
             <wp:extent cx="5406390" cy="987412"/>
@@ -19966,6 +20182,9 @@
     </w:p>
     <w:p>
       <w:r>
+        <w:rPr>
+          <w:noProof/>
+        </w:rPr>
         <w:drawing>
           <wp:inline distT="0" distB="0" distL="0" distR="0" wp14:anchorId="67FFFDD8" wp14:editId="02764EE2">
             <wp:extent cx="5353050" cy="510522"/>
@@ -20037,6 +20256,7 @@
         <w:rPr>
           <w:b/>
           <w:bCs/>
+          <w:noProof/>
         </w:rPr>
         <w:drawing>
           <wp:inline distT="0" distB="0" distL="0" distR="0" wp14:anchorId="34405053" wp14:editId="7A936FD0">
@@ -20160,8 +20380,9 @@
           <w:highlight w:val="yellow"/>
         </w:rPr>
         <w:lastRenderedPageBreak/>
-        <w:t>1.5.</w:t>
-      </w:r>
+        <w:t xml:space="preserve">1.5.3 Limitación del </w:t>
+      </w:r>
+      <w:proofErr w:type="spellStart"/>
       <w:r>
         <w:rPr>
           <w:rFonts w:cs="Arial"/>
@@ -20171,9 +20392,9 @@
           <w:szCs w:val="24"/>
           <w:highlight w:val="yellow"/>
         </w:rPr>
-        <w:t xml:space="preserve">3 Limitación del </w:t>
-      </w:r>
-      <w:proofErr w:type="spellStart"/>
+        <w:t>scraper</w:t>
+      </w:r>
+      <w:proofErr w:type="spellEnd"/>
       <w:r>
         <w:rPr>
           <w:rFonts w:cs="Arial"/>
@@ -20183,9 +20404,8 @@
           <w:szCs w:val="24"/>
           <w:highlight w:val="yellow"/>
         </w:rPr>
-        <w:t>scraper</w:t>
-      </w:r>
-      <w:proofErr w:type="spellEnd"/>
+        <w:t xml:space="preserve"> actual: sitios con JavaScript</w:t>
+      </w:r>
       <w:r>
         <w:rPr>
           <w:rFonts w:cs="Arial"/>
@@ -20195,8 +20415,9 @@
           <w:szCs w:val="24"/>
           <w:highlight w:val="yellow"/>
         </w:rPr>
-        <w:t xml:space="preserve"> actual: sitios con JavaScript</w:t>
-      </w:r>
+        <w:t xml:space="preserve"> + </w:t>
+      </w:r>
+      <w:proofErr w:type="spellStart"/>
       <w:r>
         <w:rPr>
           <w:rFonts w:cs="Arial"/>
@@ -20206,9 +20427,9 @@
           <w:szCs w:val="24"/>
           <w:highlight w:val="yellow"/>
         </w:rPr>
-        <w:t xml:space="preserve"> + </w:t>
-      </w:r>
-      <w:proofErr w:type="spellStart"/>
+        <w:t>Playwright</w:t>
+      </w:r>
+      <w:proofErr w:type="spellEnd"/>
       <w:r>
         <w:rPr>
           <w:rFonts w:cs="Arial"/>
@@ -20218,9 +20439,9 @@
           <w:szCs w:val="24"/>
           <w:highlight w:val="yellow"/>
         </w:rPr>
-        <w:t>Playwright</w:t>
-      </w:r>
-      <w:proofErr w:type="spellEnd"/>
+        <w:t xml:space="preserve"> + </w:t>
+      </w:r>
+      <w:proofErr w:type="spellStart"/>
       <w:r>
         <w:rPr>
           <w:rFonts w:cs="Arial"/>
@@ -20230,9 +20451,9 @@
           <w:szCs w:val="24"/>
           <w:highlight w:val="yellow"/>
         </w:rPr>
-        <w:t xml:space="preserve"> + </w:t>
-      </w:r>
-      <w:proofErr w:type="spellStart"/>
+        <w:t>Screenshots</w:t>
+      </w:r>
+      <w:proofErr w:type="spellEnd"/>
       <w:r>
         <w:rPr>
           <w:rFonts w:cs="Arial"/>
@@ -20242,18 +20463,6 @@
           <w:szCs w:val="24"/>
           <w:highlight w:val="yellow"/>
         </w:rPr>
-        <w:t>Screenshots</w:t>
-      </w:r>
-      <w:proofErr w:type="spellEnd"/>
-      <w:r>
-        <w:rPr>
-          <w:rFonts w:cs="Arial"/>
-          <w:b/>
-          <w:bCs/>
-          <w:sz w:val="24"/>
-          <w:szCs w:val="24"/>
-          <w:highlight w:val="yellow"/>
-        </w:rPr>
         <w:t xml:space="preserve"> de notebook</w:t>
       </w:r>
     </w:p>
@@ -20408,6 +20617,9 @@
     </w:p>
     <w:p>
       <w:r>
+        <w:rPr>
+          <w:noProof/>
+        </w:rPr>
         <w:drawing>
           <wp:inline distT="0" distB="0" distL="0" distR="0" wp14:anchorId="1205D9A3" wp14:editId="729D7B29">
             <wp:extent cx="4808220" cy="818300"/>
@@ -20501,6 +20713,9 @@
     </w:p>
     <w:p>
       <w:r>
+        <w:rPr>
+          <w:noProof/>
+        </w:rPr>
         <w:drawing>
           <wp:inline distT="0" distB="0" distL="0" distR="0" wp14:anchorId="791A9F9D" wp14:editId="0F5F2962">
             <wp:extent cx="5487413" cy="2750820"/>
@@ -20877,6 +21092,9 @@
         </w:rPr>
       </w:pPr>
       <w:r>
+        <w:rPr>
+          <w:noProof/>
+        </w:rPr>
         <w:lastRenderedPageBreak/>
         <w:drawing>
           <wp:inline distT="0" distB="0" distL="0" distR="0" wp14:anchorId="235DC1AD" wp14:editId="5E980A47">
@@ -20923,6 +21141,9 @@
         </w:drawing>
       </w:r>
       <w:r>
+        <w:rPr>
+          <w:noProof/>
+        </w:rPr>
         <w:drawing>
           <wp:inline distT="0" distB="0" distL="0" distR="0" wp14:anchorId="0B985B31" wp14:editId="07E737AD">
             <wp:extent cx="6012180" cy="1177942"/>
@@ -20971,6 +21192,7 @@
         <w:rPr>
           <w:b/>
           <w:bCs/>
+          <w:noProof/>
         </w:rPr>
         <w:drawing>
           <wp:inline distT="0" distB="0" distL="0" distR="0" wp14:anchorId="1492B757" wp14:editId="6B780FF3">
@@ -21211,6 +21433,7 @@
         <w:rPr>
           <w:b/>
           <w:bCs/>
+          <w:noProof/>
         </w:rPr>
         <w:drawing>
           <wp:inline distT="0" distB="0" distL="0" distR="0" wp14:anchorId="05B0CC4B" wp14:editId="33CDF490">
@@ -21260,6 +21483,7 @@
         <w:rPr>
           <w:b/>
           <w:bCs/>
+          <w:noProof/>
         </w:rPr>
         <w:drawing>
           <wp:inline distT="0" distB="0" distL="0" distR="0" wp14:anchorId="7785ECCC" wp14:editId="648EC4EF">
@@ -21314,6 +21538,1524 @@
         </w:rPr>
       </w:pPr>
     </w:p>
+    <w:p>
+      <w:pPr>
+        <w:pStyle w:val="Ttulo2"/>
+        <w:numPr>
+          <w:ilvl w:val="1"/>
+          <w:numId w:val="27"/>
+        </w:numPr>
+        <w:rPr>
+          <w:rFonts w:ascii="Arial" w:hAnsi="Arial" w:cs="Arial"/>
+          <w:b/>
+          <w:bCs/>
+          <w:sz w:val="24"/>
+          <w:szCs w:val="24"/>
+          <w:highlight w:val="yellow"/>
+        </w:rPr>
+      </w:pPr>
+      <w:r>
+        <w:rPr>
+          <w:rFonts w:ascii="Arial" w:hAnsi="Arial" w:cs="Arial"/>
+          <w:b/>
+          <w:bCs/>
+          <w:sz w:val="24"/>
+          <w:szCs w:val="24"/>
+          <w:highlight w:val="yellow"/>
+        </w:rPr>
+        <w:lastRenderedPageBreak/>
+        <w:t>FINAL-</w:t>
+      </w:r>
+      <w:r>
+        <w:rPr>
+          <w:rFonts w:ascii="Arial" w:hAnsi="Arial" w:cs="Arial"/>
+          <w:b/>
+          <w:bCs/>
+          <w:sz w:val="24"/>
+          <w:szCs w:val="24"/>
+          <w:highlight w:val="yellow"/>
+        </w:rPr>
+        <w:t xml:space="preserve">DIA-1: </w:t>
+      </w:r>
+      <w:r>
+        <w:rPr>
+          <w:rFonts w:ascii="Arial" w:hAnsi="Arial" w:cs="Arial"/>
+          <w:b/>
+          <w:bCs/>
+          <w:sz w:val="24"/>
+          <w:szCs w:val="24"/>
+          <w:highlight w:val="yellow"/>
+        </w:rPr>
+        <w:t>Ejercicio final – tu propia llamada a un LLM desde cero</w:t>
+      </w:r>
+    </w:p>
+    <w:p>
+      <w:pPr>
+        <w:rPr>
+          <w:b/>
+          <w:bCs/>
+          <w:sz w:val="24"/>
+          <w:szCs w:val="28"/>
+        </w:rPr>
+      </w:pPr>
+      <w:r>
+        <w:rPr>
+          <w:b/>
+          <w:bCs/>
+          <w:sz w:val="24"/>
+          <w:szCs w:val="28"/>
+        </w:rPr>
+        <w:t>El desafío del profesor</w:t>
+      </w:r>
+    </w:p>
+    <w:p>
+      <w:r>
+        <w:t>Después de construir el resumidor de páginas web, el profesor deja de dar el código armado y pide escribirlo desde cero, aplicado a una idea de negocio distinta. Entrega una plantilla con los pasos marcados pero vacíos:</w:t>
+      </w:r>
+    </w:p>
+    <w:p>
+      <w:r>
+        <w:drawing>
+          <wp:inline distT="0" distB="0" distL="0" distR="0" wp14:anchorId="10FB77AD" wp14:editId="52B46CFC">
+            <wp:extent cx="5151120" cy="2489807"/>
+            <wp:effectExtent l="38100" t="38100" r="30480" b="44450"/>
+            <wp:docPr id="1930524823" name="Imagen 1"/>
+            <wp:cNvGraphicFramePr>
+              <a:graphicFrameLocks xmlns:a="http://schemas.openxmlformats.org/drawingml/2006/main" noChangeAspect="1"/>
+            </wp:cNvGraphicFramePr>
+            <a:graphic xmlns:a="http://schemas.openxmlformats.org/drawingml/2006/main">
+              <a:graphicData uri="http://schemas.openxmlformats.org/drawingml/2006/picture">
+                <pic:pic xmlns:pic="http://schemas.openxmlformats.org/drawingml/2006/picture">
+                  <pic:nvPicPr>
+                    <pic:cNvPr id="1930524823" name=""/>
+                    <pic:cNvPicPr/>
+                  </pic:nvPicPr>
+                  <pic:blipFill>
+                    <a:blip r:embed="rId93"/>
+                    <a:stretch>
+                      <a:fillRect/>
+                    </a:stretch>
+                  </pic:blipFill>
+                  <pic:spPr>
+                    <a:xfrm>
+                      <a:off x="0" y="0"/>
+                      <a:ext cx="5158282" cy="2493269"/>
+                    </a:xfrm>
+                    <a:prstGeom prst="rect">
+                      <a:avLst/>
+                    </a:prstGeom>
+                    <a:ln w="28575">
+                      <a:solidFill>
+                        <a:srgbClr val="00B0F0"/>
+                      </a:solidFill>
+                    </a:ln>
+                  </pic:spPr>
+                </pic:pic>
+              </a:graphicData>
+            </a:graphic>
+          </wp:inline>
+        </w:drawing>
+      </w:r>
+    </w:p>
+    <w:p>
+      <w:pPr>
+        <w:rPr>
+          <w:b/>
+          <w:bCs/>
+        </w:rPr>
+      </w:pPr>
+      <w:r>
+        <w:rPr>
+          <w:b/>
+          <w:bCs/>
+        </w:rPr>
+        <w:t>Cómo completarlo, paso a paso</w:t>
+      </w:r>
+    </w:p>
+    <w:p>
+      <w:pPr>
+        <w:pStyle w:val="Prrafodelista"/>
+        <w:numPr>
+          <w:ilvl w:val="0"/>
+          <w:numId w:val="31"/>
+        </w:numPr>
+      </w:pPr>
+      <w:r>
+        <w:rPr>
+          <w:b/>
+          <w:bCs/>
+        </w:rPr>
+        <w:t>Pensar una idea de negocio distinta</w:t>
+      </w:r>
+      <w:r>
+        <w:t xml:space="preserve"> a resumir páginas web. El profesor da dos ejemplos: resumir el contenido de un email, o generar un buen asunto (</w:t>
+      </w:r>
+      <w:proofErr w:type="spellStart"/>
+      <w:r>
+        <w:t>subject</w:t>
+      </w:r>
+      <w:proofErr w:type="spellEnd"/>
+      <w:r>
+        <w:t xml:space="preserve"> line) a partir del cuerpo de un correo. </w:t>
+      </w:r>
+    </w:p>
+    <w:p>
+      <w:pPr>
+        <w:pStyle w:val="Prrafodelista"/>
+        <w:numPr>
+          <w:ilvl w:val="0"/>
+          <w:numId w:val="31"/>
+        </w:numPr>
+      </w:pPr>
+      <w:r>
+        <w:rPr>
+          <w:b/>
+          <w:bCs/>
+        </w:rPr>
+        <w:t xml:space="preserve">Escribir el </w:t>
+      </w:r>
+      <w:proofErr w:type="spellStart"/>
+      <w:r>
+        <w:rPr>
+          <w:b/>
+          <w:bCs/>
+        </w:rPr>
+        <w:t>system_prompt</w:t>
+      </w:r>
+      <w:proofErr w:type="spellEnd"/>
+      <w:r>
+        <w:t>: una instrucción clara que describa la tarea (ej. "</w:t>
+      </w:r>
+      <w:proofErr w:type="spellStart"/>
+      <w:r>
+        <w:t>Sos</w:t>
+      </w:r>
+      <w:proofErr w:type="spellEnd"/>
+      <w:r>
+        <w:t xml:space="preserve"> un asistente que lee un email y sugiere un asunto corto y claro para él"). </w:t>
+      </w:r>
+    </w:p>
+    <w:p>
+      <w:pPr>
+        <w:pStyle w:val="Prrafodelista"/>
+        <w:numPr>
+          <w:ilvl w:val="0"/>
+          <w:numId w:val="31"/>
+        </w:numPr>
+      </w:pPr>
+      <w:r>
+        <w:rPr>
+          <w:b/>
+          <w:bCs/>
+        </w:rPr>
+        <w:t xml:space="preserve">Escribir el </w:t>
+      </w:r>
+      <w:proofErr w:type="spellStart"/>
+      <w:r>
+        <w:rPr>
+          <w:b/>
+          <w:bCs/>
+        </w:rPr>
+        <w:t>user_prompt</w:t>
+      </w:r>
+      <w:proofErr w:type="spellEnd"/>
+      <w:r>
+        <w:t xml:space="preserve">: el contenido real a procesar (el texto del email, por ejemplo). </w:t>
+      </w:r>
+    </w:p>
+    <w:p>
+      <w:pPr>
+        <w:pStyle w:val="Prrafodelista"/>
+        <w:numPr>
+          <w:ilvl w:val="0"/>
+          <w:numId w:val="31"/>
+        </w:numPr>
+      </w:pPr>
+      <w:r>
+        <w:rPr>
+          <w:b/>
+          <w:bCs/>
+        </w:rPr>
+        <w:t xml:space="preserve">Armar la lista </w:t>
+      </w:r>
+      <w:proofErr w:type="spellStart"/>
+      <w:r>
+        <w:rPr>
+          <w:b/>
+          <w:bCs/>
+        </w:rPr>
+        <w:t>messages</w:t>
+      </w:r>
+      <w:proofErr w:type="spellEnd"/>
+      <w:r>
+        <w:t>: los dos diccionarios (</w:t>
+      </w:r>
+      <w:proofErr w:type="spellStart"/>
+      <w:r>
+        <w:rPr>
+          <w:b/>
+          <w:bCs/>
+        </w:rPr>
+        <w:t>system</w:t>
+      </w:r>
+      <w:proofErr w:type="spellEnd"/>
+      <w:r>
+        <w:t xml:space="preserve"> + </w:t>
+      </w:r>
+      <w:proofErr w:type="spellStart"/>
+      <w:r>
+        <w:rPr>
+          <w:b/>
+          <w:bCs/>
+        </w:rPr>
+        <w:t>user</w:t>
+      </w:r>
+      <w:proofErr w:type="spellEnd"/>
+      <w:r>
+        <w:t xml:space="preserve">), como se vino haciendo en todo el laboratorio. El profesor aclara: usar herramientas de IA para ayudarte con esto </w:t>
+      </w:r>
+      <w:r>
+        <w:rPr>
+          <w:b/>
+          <w:bCs/>
+        </w:rPr>
+        <w:t>no es hacer trampa</w:t>
+      </w:r>
+      <w:r>
+        <w:t xml:space="preserve">. </w:t>
+      </w:r>
+    </w:p>
+    <w:p>
+      <w:pPr>
+        <w:pStyle w:val="Prrafodelista"/>
+        <w:numPr>
+          <w:ilvl w:val="0"/>
+          <w:numId w:val="31"/>
+        </w:numPr>
+      </w:pPr>
+      <w:proofErr w:type="spellStart"/>
+      <w:r>
+        <w:rPr>
+          <w:b/>
+          <w:bCs/>
+        </w:rPr>
+        <w:t>Descomentar</w:t>
+      </w:r>
+      <w:proofErr w:type="spellEnd"/>
+      <w:r>
+        <w:rPr>
+          <w:b/>
+          <w:bCs/>
+        </w:rPr>
+        <w:t xml:space="preserve"> y completar response =</w:t>
+      </w:r>
+      <w:r>
+        <w:t xml:space="preserve">: la llamada al modelo (en la versión adaptada a Gemini: </w:t>
+      </w:r>
+      <w:proofErr w:type="spellStart"/>
+      <w:proofErr w:type="gramStart"/>
+      <w:r>
+        <w:rPr>
+          <w:b/>
+          <w:bCs/>
+        </w:rPr>
+        <w:t>client.models</w:t>
+      </w:r>
+      <w:proofErr w:type="gramEnd"/>
+      <w:r>
+        <w:rPr>
+          <w:b/>
+          <w:bCs/>
+        </w:rPr>
+        <w:t>.generate_content</w:t>
+      </w:r>
+      <w:proofErr w:type="spellEnd"/>
+      <w:r>
+        <w:rPr>
+          <w:b/>
+          <w:bCs/>
+        </w:rPr>
+        <w:t>(...)</w:t>
+      </w:r>
+      <w:r>
+        <w:t xml:space="preserve">, en vez de </w:t>
+      </w:r>
+      <w:proofErr w:type="spellStart"/>
+      <w:proofErr w:type="gramStart"/>
+      <w:r>
+        <w:rPr>
+          <w:b/>
+          <w:bCs/>
+        </w:rPr>
+        <w:t>openai.chat</w:t>
+      </w:r>
+      <w:proofErr w:type="gramEnd"/>
+      <w:r>
+        <w:rPr>
+          <w:b/>
+          <w:bCs/>
+        </w:rPr>
+        <w:t>.</w:t>
+      </w:r>
+      <w:proofErr w:type="gramStart"/>
+      <w:r>
+        <w:rPr>
+          <w:b/>
+          <w:bCs/>
+        </w:rPr>
+        <w:t>completions.create</w:t>
+      </w:r>
+      <w:proofErr w:type="spellEnd"/>
+      <w:proofErr w:type="gramEnd"/>
+      <w:r>
+        <w:rPr>
+          <w:b/>
+          <w:bCs/>
+        </w:rPr>
+        <w:t>(...)</w:t>
+      </w:r>
+      <w:r>
+        <w:t xml:space="preserve"> como en el video original). </w:t>
+      </w:r>
+    </w:p>
+    <w:p>
+      <w:pPr>
+        <w:pStyle w:val="Prrafodelista"/>
+        <w:numPr>
+          <w:ilvl w:val="0"/>
+          <w:numId w:val="31"/>
+        </w:numPr>
+      </w:pPr>
+      <w:proofErr w:type="spellStart"/>
+      <w:r>
+        <w:rPr>
+          <w:b/>
+          <w:bCs/>
+        </w:rPr>
+        <w:t>Descomentar</w:t>
+      </w:r>
+      <w:proofErr w:type="spellEnd"/>
+      <w:r>
+        <w:rPr>
+          <w:b/>
+          <w:bCs/>
+        </w:rPr>
+        <w:t xml:space="preserve"> e imprimir el resultado</w:t>
+      </w:r>
+      <w:r>
+        <w:t xml:space="preserve">: con </w:t>
+      </w:r>
+      <w:proofErr w:type="spellStart"/>
+      <w:r>
+        <w:t>response.text</w:t>
+      </w:r>
+      <w:proofErr w:type="spellEnd"/>
+      <w:r>
+        <w:t xml:space="preserve"> (Gemini) en vez de </w:t>
+      </w:r>
+      <w:proofErr w:type="spellStart"/>
+      <w:proofErr w:type="gramStart"/>
+      <w:r>
+        <w:rPr>
+          <w:b/>
+          <w:bCs/>
+        </w:rPr>
+        <w:t>response.choices</w:t>
+      </w:r>
+      <w:proofErr w:type="spellEnd"/>
+      <w:proofErr w:type="gramEnd"/>
+      <w:r>
+        <w:rPr>
+          <w:b/>
+          <w:bCs/>
+        </w:rPr>
+        <w:t>[0</w:t>
+      </w:r>
+      <w:proofErr w:type="gramStart"/>
+      <w:r>
+        <w:rPr>
+          <w:b/>
+          <w:bCs/>
+        </w:rPr>
+        <w:t>].</w:t>
+      </w:r>
+      <w:proofErr w:type="spellStart"/>
+      <w:r>
+        <w:rPr>
+          <w:b/>
+          <w:bCs/>
+        </w:rPr>
+        <w:t>message</w:t>
+      </w:r>
+      <w:proofErr w:type="gramEnd"/>
+      <w:r>
+        <w:rPr>
+          <w:b/>
+          <w:bCs/>
+        </w:rPr>
+        <w:t>.content</w:t>
+      </w:r>
+      <w:proofErr w:type="spellEnd"/>
+      <w:r>
+        <w:t xml:space="preserve"> (</w:t>
+      </w:r>
+      <w:proofErr w:type="spellStart"/>
+      <w:r>
+        <w:t>OpenAI</w:t>
+      </w:r>
+      <w:proofErr w:type="spellEnd"/>
+      <w:r>
+        <w:t>).</w:t>
+      </w:r>
+    </w:p>
+    <w:p/>
+    <w:p>
+      <w:pPr>
+        <w:rPr>
+          <w:b/>
+          <w:bCs/>
+        </w:rPr>
+      </w:pPr>
+    </w:p>
+    <w:p>
+      <w:pPr>
+        <w:rPr>
+          <w:b/>
+          <w:bCs/>
+        </w:rPr>
+      </w:pPr>
+    </w:p>
+    <w:p>
+      <w:pPr>
+        <w:rPr>
+          <w:b/>
+          <w:bCs/>
+        </w:rPr>
+      </w:pPr>
+    </w:p>
+    <w:p>
+      <w:pPr>
+        <w:rPr>
+          <w:b/>
+          <w:bCs/>
+        </w:rPr>
+      </w:pPr>
+    </w:p>
+    <w:p>
+      <w:pPr>
+        <w:rPr>
+          <w:b/>
+          <w:bCs/>
+        </w:rPr>
+      </w:pPr>
+    </w:p>
+    <w:p>
+      <w:pPr>
+        <w:rPr>
+          <w:b/>
+          <w:bCs/>
+        </w:rPr>
+      </w:pPr>
+    </w:p>
+    <w:p>
+      <w:pPr>
+        <w:rPr>
+          <w:b/>
+          <w:bCs/>
+        </w:rPr>
+      </w:pPr>
+    </w:p>
+    <w:p>
+      <w:pPr>
+        <w:rPr>
+          <w:b/>
+          <w:bCs/>
+        </w:rPr>
+      </w:pPr>
+    </w:p>
+    <w:p>
+      <w:pPr>
+        <w:pStyle w:val="Ttulo3"/>
+        <w:rPr>
+          <w:b/>
+          <w:bCs/>
+          <w:sz w:val="24"/>
+          <w:szCs w:val="24"/>
+        </w:rPr>
+      </w:pPr>
+      <w:r>
+        <w:rPr>
+          <w:b/>
+          <w:bCs/>
+          <w:sz w:val="24"/>
+          <w:szCs w:val="24"/>
+          <w:highlight w:val="yellow"/>
+        </w:rPr>
+        <w:lastRenderedPageBreak/>
+        <w:t xml:space="preserve">1.6.1 </w:t>
+      </w:r>
+      <w:r>
+        <w:rPr>
+          <w:b/>
+          <w:bCs/>
+          <w:sz w:val="24"/>
+          <w:szCs w:val="24"/>
+          <w:highlight w:val="yellow"/>
+        </w:rPr>
+        <w:t xml:space="preserve">Ejercicio extra opcional: </w:t>
+      </w:r>
+      <w:proofErr w:type="spellStart"/>
+      <w:r>
+        <w:rPr>
+          <w:b/>
+          <w:bCs/>
+          <w:sz w:val="24"/>
+          <w:szCs w:val="24"/>
+          <w:highlight w:val="yellow"/>
+        </w:rPr>
+        <w:t>scraping</w:t>
+      </w:r>
+      <w:proofErr w:type="spellEnd"/>
+      <w:r>
+        <w:rPr>
+          <w:b/>
+          <w:bCs/>
+          <w:sz w:val="24"/>
+          <w:szCs w:val="24"/>
+          <w:highlight w:val="yellow"/>
+        </w:rPr>
+        <w:t xml:space="preserve"> "industrial"</w:t>
+      </w:r>
+      <w:r>
+        <w:rPr>
+          <w:b/>
+          <w:bCs/>
+          <w:sz w:val="24"/>
+          <w:szCs w:val="24"/>
+          <w:highlight w:val="yellow"/>
+        </w:rPr>
+        <w:t xml:space="preserve"> + 5 ideas de desafío para practicar (investigadas)</w:t>
+      </w:r>
+      <w:r>
+        <w:rPr>
+          <w:b/>
+          <w:bCs/>
+          <w:sz w:val="24"/>
+          <w:szCs w:val="24"/>
+          <w:highlight w:val="yellow"/>
+        </w:rPr>
+        <w:t xml:space="preserve"> + Consejo general para cualquiera de estos desafíos</w:t>
+      </w:r>
+    </w:p>
+    <w:p>
+      <w:r>
+        <w:t xml:space="preserve">Para quienes ya conocen </w:t>
+      </w:r>
+      <w:proofErr w:type="spellStart"/>
+      <w:r>
+        <w:t>Selenium</w:t>
+      </w:r>
+      <w:proofErr w:type="spellEnd"/>
+      <w:r>
+        <w:t xml:space="preserve"> o </w:t>
+      </w:r>
+      <w:proofErr w:type="spellStart"/>
+      <w:r>
+        <w:t>Playwright</w:t>
+      </w:r>
+      <w:proofErr w:type="spellEnd"/>
+      <w:r>
+        <w:t xml:space="preserve">, el profesor sugiere construir una versión más robusta del resumidor web, que sí funcione en sitios renderizados con JavaScript — hay ejemplos de otros estudiantes en </w:t>
+      </w:r>
+      <w:proofErr w:type="spellStart"/>
+      <w:r>
+        <w:rPr>
+          <w:b/>
+          <w:bCs/>
+        </w:rPr>
+        <w:t>community-contributions</w:t>
+      </w:r>
+      <w:proofErr w:type="spellEnd"/>
+      <w:r>
+        <w:t xml:space="preserve">, incluida una versión con </w:t>
+      </w:r>
+      <w:proofErr w:type="spellStart"/>
+      <w:r>
+        <w:t>Playwright</w:t>
+      </w:r>
+      <w:proofErr w:type="spellEnd"/>
+      <w:r>
+        <w:t>.</w:t>
+      </w:r>
+    </w:p>
+    <w:p>
+      <w:pPr>
+        <w:rPr>
+          <w:b/>
+          <w:bCs/>
+        </w:rPr>
+      </w:pPr>
+      <w:r>
+        <w:rPr>
+          <w:noProof/>
+        </w:rPr>
+        <w:drawing>
+          <wp:inline distT="0" distB="0" distL="0" distR="0" wp14:anchorId="6A5A04DC" wp14:editId="4522D1E4">
+            <wp:extent cx="3542983" cy="2842260"/>
+            <wp:effectExtent l="0" t="0" r="635" b="0"/>
+            <wp:docPr id="1223357109" name="Imagen 3"/>
+            <wp:cNvGraphicFramePr>
+              <a:graphicFrameLocks xmlns:a="http://schemas.openxmlformats.org/drawingml/2006/main" noChangeAspect="1"/>
+            </wp:cNvGraphicFramePr>
+            <a:graphic xmlns:a="http://schemas.openxmlformats.org/drawingml/2006/main">
+              <a:graphicData uri="http://schemas.openxmlformats.org/drawingml/2006/picture">
+                <pic:pic xmlns:pic="http://schemas.openxmlformats.org/drawingml/2006/picture">
+                  <pic:nvPicPr>
+                    <pic:cNvPr id="0" name="Picture 3"/>
+                    <pic:cNvPicPr>
+                      <a:picLocks noChangeAspect="1" noChangeArrowheads="1"/>
+                    </pic:cNvPicPr>
+                  </pic:nvPicPr>
+                  <pic:blipFill>
+                    <a:blip r:embed="rId94" cstate="print">
+                      <a:extLst>
+                        <a:ext uri="{28A0092B-C50C-407E-A947-70E740481C1C}">
+                          <a14:useLocalDpi xmlns:a14="http://schemas.microsoft.com/office/drawing/2010/main" val="0"/>
+                        </a:ext>
+                      </a:extLst>
+                    </a:blip>
+                    <a:srcRect/>
+                    <a:stretch>
+                      <a:fillRect/>
+                    </a:stretch>
+                  </pic:blipFill>
+                  <pic:spPr bwMode="auto">
+                    <a:xfrm>
+                      <a:off x="0" y="0"/>
+                      <a:ext cx="3545502" cy="2844281"/>
+                    </a:xfrm>
+                    <a:prstGeom prst="rect">
+                      <a:avLst/>
+                    </a:prstGeom>
+                    <a:noFill/>
+                    <a:ln>
+                      <a:noFill/>
+                    </a:ln>
+                  </pic:spPr>
+                </pic:pic>
+              </a:graphicData>
+            </a:graphic>
+          </wp:inline>
+        </w:drawing>
+      </w:r>
+    </w:p>
+    <w:p>
+      <w:pPr>
+        <w:rPr>
+          <w:b/>
+          <w:bCs/>
+        </w:rPr>
+      </w:pPr>
+      <w:r>
+        <w:rPr>
+          <w:b/>
+          <w:bCs/>
+        </w:rPr>
+        <w:t>Balance del Día 1 (según el profesor)</w:t>
+      </w:r>
+    </w:p>
+    <w:p>
+      <w:pPr>
+        <w:rPr>
+          <w:b/>
+          <w:bCs/>
+        </w:rPr>
+      </w:pPr>
+      <w:r>
+        <w:rPr>
+          <w:b/>
+          <w:bCs/>
+        </w:rPr>
+        <w:t xml:space="preserve">Ya </w:t>
+      </w:r>
+      <w:proofErr w:type="spellStart"/>
+      <w:r>
+        <w:rPr>
+          <w:b/>
+          <w:bCs/>
+        </w:rPr>
+        <w:t>sabés</w:t>
+      </w:r>
+      <w:proofErr w:type="spellEnd"/>
+      <w:r>
+        <w:rPr>
+          <w:b/>
+          <w:bCs/>
+        </w:rPr>
+        <w:t xml:space="preserve"> hacer:</w:t>
+      </w:r>
+    </w:p>
+    <w:p>
+      <w:pPr>
+        <w:pStyle w:val="Prrafodelista"/>
+        <w:numPr>
+          <w:ilvl w:val="0"/>
+          <w:numId w:val="3"/>
+        </w:numPr>
+      </w:pPr>
+      <w:r>
+        <w:t xml:space="preserve">Usar Ollama para correr </w:t>
+      </w:r>
+      <w:proofErr w:type="spellStart"/>
+      <w:r>
+        <w:t>LLMs</w:t>
+      </w:r>
+      <w:proofErr w:type="spellEnd"/>
+      <w:r>
+        <w:t xml:space="preserve"> localmente</w:t>
+      </w:r>
+    </w:p>
+    <w:p>
+      <w:pPr>
+        <w:pStyle w:val="Prrafodelista"/>
+        <w:numPr>
+          <w:ilvl w:val="0"/>
+          <w:numId w:val="3"/>
+        </w:numPr>
+      </w:pPr>
+      <w:r>
+        <w:t>Escribir código que llama a modelos frontera</w:t>
+      </w:r>
+    </w:p>
+    <w:p>
+      <w:pPr>
+        <w:pStyle w:val="Prrafodelista"/>
+        <w:numPr>
+          <w:ilvl w:val="0"/>
+          <w:numId w:val="3"/>
+        </w:numPr>
+      </w:pPr>
+      <w:r>
+        <w:t xml:space="preserve">Distinguir </w:t>
+      </w:r>
+      <w:proofErr w:type="spellStart"/>
+      <w:r>
+        <w:t>system</w:t>
+      </w:r>
+      <w:proofErr w:type="spellEnd"/>
+      <w:r>
+        <w:t xml:space="preserve"> </w:t>
+      </w:r>
+      <w:proofErr w:type="spellStart"/>
+      <w:r>
+        <w:t>prompt</w:t>
+      </w:r>
+      <w:proofErr w:type="spellEnd"/>
+      <w:r>
+        <w:t xml:space="preserve"> de </w:t>
+      </w:r>
+      <w:proofErr w:type="spellStart"/>
+      <w:r>
+        <w:t>user</w:t>
+      </w:r>
+      <w:proofErr w:type="spellEnd"/>
+      <w:r>
+        <w:t xml:space="preserve"> </w:t>
+      </w:r>
+      <w:proofErr w:type="spellStart"/>
+      <w:r>
+        <w:t>prompt</w:t>
+      </w:r>
+      <w:proofErr w:type="spellEnd"/>
+    </w:p>
+    <w:p>
+      <w:pPr>
+        <w:pStyle w:val="Prrafodelista"/>
+        <w:numPr>
+          <w:ilvl w:val="0"/>
+          <w:numId w:val="3"/>
+        </w:numPr>
+      </w:pPr>
+      <w:r>
+        <w:t>Resumir contenido — aplicable a muchos problemas comerciales</w:t>
+      </w:r>
+    </w:p>
+    <w:p>
+      <w:pPr>
+        <w:rPr>
+          <w:b/>
+          <w:bCs/>
+        </w:rPr>
+      </w:pPr>
+      <w:r>
+        <w:rPr>
+          <w:b/>
+          <w:bCs/>
+        </w:rPr>
+        <w:t>Mañana (Día 2) vas a poder:</w:t>
+      </w:r>
+    </w:p>
+    <w:p>
+      <w:pPr>
+        <w:pStyle w:val="Prrafodelista"/>
+        <w:numPr>
+          <w:ilvl w:val="0"/>
+          <w:numId w:val="3"/>
+        </w:numPr>
+      </w:pPr>
+      <w:r>
+        <w:t xml:space="preserve">Conocer los pasos exactos hacia el dominio de LLM </w:t>
+      </w:r>
+      <w:proofErr w:type="spellStart"/>
+      <w:r>
+        <w:t>Engineering</w:t>
+      </w:r>
+      <w:proofErr w:type="spellEnd"/>
+    </w:p>
+    <w:p>
+      <w:pPr>
+        <w:pStyle w:val="Prrafodelista"/>
+        <w:numPr>
+          <w:ilvl w:val="0"/>
+          <w:numId w:val="3"/>
+        </w:numPr>
+      </w:pPr>
+      <w:r>
+        <w:t>Reconocer los principales modelos frontera y cómo usarlos</w:t>
+      </w:r>
+    </w:p>
+    <w:p>
+      <w:pPr>
+        <w:pBdr>
+          <w:bottom w:val="single" w:sz="6" w:space="1" w:color="auto"/>
+        </w:pBdr>
+      </w:pPr>
+      <w:r>
+        <w:t xml:space="preserve">Dato de cierre: el profesor calcula, en broma, que con todo esto ya estás en el </w:t>
+      </w:r>
+      <w:r>
+        <w:rPr>
+          <w:b/>
+          <w:bCs/>
+        </w:rPr>
+        <w:t>2.5% del camino</w:t>
+      </w:r>
+      <w:r>
+        <w:t xml:space="preserve"> hacia ser "maestro de LLM </w:t>
+      </w:r>
+      <w:proofErr w:type="spellStart"/>
+      <w:r>
+        <w:t>Engineering</w:t>
+      </w:r>
+      <w:proofErr w:type="spellEnd"/>
+      <w:r>
+        <w:t>".</w:t>
+      </w:r>
+    </w:p>
+    <w:p>
+      <w:pPr>
+        <w:rPr>
+          <w:b/>
+          <w:bCs/>
+          <w:sz w:val="24"/>
+          <w:szCs w:val="28"/>
+        </w:rPr>
+      </w:pPr>
+      <w:r>
+        <w:rPr>
+          <w:b/>
+          <w:bCs/>
+          <w:sz w:val="24"/>
+          <w:szCs w:val="28"/>
+          <w:highlight w:val="yellow"/>
+        </w:rPr>
+        <w:t>5 ideas de desafío para practicar (investigadas)</w:t>
+      </w:r>
+    </w:p>
+    <w:p>
+      <w:pPr>
+        <w:rPr>
+          <w:b/>
+          <w:bCs/>
+          <w:sz w:val="24"/>
+          <w:szCs w:val="28"/>
+        </w:rPr>
+      </w:pPr>
+      <w:r>
+        <w:rPr>
+          <w:b/>
+          <w:bCs/>
+          <w:sz w:val="24"/>
+          <w:szCs w:val="28"/>
+          <w:highlight w:val="yellow"/>
+        </w:rPr>
+        <w:t>1. Generador de asunto para emails</w:t>
+      </w:r>
+    </w:p>
+    <w:p>
+      <w:r>
+        <w:t xml:space="preserve">Basado en los usos más comunes y efectivos de </w:t>
+      </w:r>
+      <w:proofErr w:type="spellStart"/>
+      <w:r>
+        <w:t>prompt</w:t>
+      </w:r>
+      <w:proofErr w:type="spellEnd"/>
+      <w:r>
+        <w:t xml:space="preserve"> </w:t>
+      </w:r>
+      <w:proofErr w:type="spellStart"/>
+      <w:r>
+        <w:t>engineering</w:t>
+      </w:r>
+      <w:proofErr w:type="spellEnd"/>
+      <w:r>
+        <w:t xml:space="preserve"> para tareas de negocio, estas son cinco variantes del mismo patrón (</w:t>
+      </w:r>
+      <w:proofErr w:type="spellStart"/>
+      <w:r>
+        <w:t>system_prompt</w:t>
+      </w:r>
+      <w:proofErr w:type="spellEnd"/>
+      <w:r>
+        <w:t xml:space="preserve"> + </w:t>
+      </w:r>
+      <w:proofErr w:type="spellStart"/>
+      <w:r>
+        <w:t>user_prompt</w:t>
+      </w:r>
+      <w:proofErr w:type="spellEnd"/>
+      <w:r>
+        <w:t xml:space="preserve"> + llamada al modelo) para practicar, de menor a mayor complejidad:</w:t>
+      </w:r>
+    </w:p>
+    <w:p>
+      <w:r>
+        <w:rPr>
+          <w:b/>
+          <w:bCs/>
+        </w:rPr>
+        <w:t>Por qué es un buen desafío inicial:</w:t>
+      </w:r>
+      <w:r>
+        <w:t xml:space="preserve"> es casi idéntico al ejemplo del profesor, ideal para practicar la mecánica sin complicarse con la idea.</w:t>
+      </w:r>
+    </w:p>
+    <w:p/>
+    <w:p/>
+    <w:p>
+      <w:pPr>
+        <w:rPr>
+          <w:b/>
+          <w:bCs/>
+          <w:sz w:val="24"/>
+          <w:szCs w:val="28"/>
+        </w:rPr>
+      </w:pPr>
+      <w:r>
+        <w:rPr>
+          <w:b/>
+          <w:bCs/>
+          <w:sz w:val="24"/>
+          <w:szCs w:val="28"/>
+          <w:highlight w:val="yellow"/>
+        </w:rPr>
+        <w:lastRenderedPageBreak/>
+        <w:t>2. Análisis de sentimiento de reseñas de producto</w:t>
+      </w:r>
+    </w:p>
+    <w:p>
+      <w:proofErr w:type="spellStart"/>
+      <w:r>
+        <w:rPr>
+          <w:b/>
+          <w:bCs/>
+        </w:rPr>
+        <w:t>system_prompt</w:t>
+      </w:r>
+      <w:proofErr w:type="spellEnd"/>
+      <w:r>
+        <w:rPr>
+          <w:b/>
+          <w:bCs/>
+        </w:rPr>
+        <w:t>:</w:t>
+      </w:r>
+      <w:r>
+        <w:t xml:space="preserve"> "</w:t>
+      </w:r>
+      <w:proofErr w:type="spellStart"/>
+      <w:r>
+        <w:t>Sos</w:t>
+      </w:r>
+      <w:proofErr w:type="spellEnd"/>
+      <w:r>
+        <w:t xml:space="preserve"> un analista que clasifica reseñas de clientes como Positiva, Negativa o Neutral, y explica en una frase por qué". </w:t>
+      </w:r>
+      <w:proofErr w:type="spellStart"/>
+      <w:r>
+        <w:rPr>
+          <w:b/>
+          <w:bCs/>
+        </w:rPr>
+        <w:t>user_prompt</w:t>
+      </w:r>
+      <w:proofErr w:type="spellEnd"/>
+      <w:r>
+        <w:rPr>
+          <w:b/>
+          <w:bCs/>
+        </w:rPr>
+        <w:t>:</w:t>
+      </w:r>
+      <w:r>
+        <w:t xml:space="preserve"> una reseña real (se puede tomar de cualquier producto en Amazon, MercadoLibre, etc.).</w:t>
+      </w:r>
+    </w:p>
+    <w:p>
+      <w:r>
+        <w:rPr>
+          <w:b/>
+          <w:bCs/>
+        </w:rPr>
+        <w:t>Por qué es útil:</w:t>
+      </w:r>
+      <w:r>
+        <w:t xml:space="preserve"> es uno de los casos de uso más comunes de </w:t>
+      </w:r>
+      <w:proofErr w:type="spellStart"/>
+      <w:r>
+        <w:t>LLMs</w:t>
+      </w:r>
+      <w:proofErr w:type="spellEnd"/>
+      <w:r>
+        <w:t xml:space="preserve"> en negocios reales — analizar </w:t>
+      </w:r>
+      <w:proofErr w:type="spellStart"/>
+      <w:r>
+        <w:t>feedback</w:t>
+      </w:r>
+      <w:proofErr w:type="spellEnd"/>
+      <w:r>
+        <w:t xml:space="preserve"> de clientes a escala, sin tener que leer cada reseña a mano.</w:t>
+      </w:r>
+    </w:p>
+    <w:p>
+      <w:pPr>
+        <w:rPr>
+          <w:b/>
+          <w:bCs/>
+          <w:sz w:val="24"/>
+          <w:szCs w:val="28"/>
+        </w:rPr>
+      </w:pPr>
+      <w:r>
+        <w:rPr>
+          <w:b/>
+          <w:bCs/>
+          <w:sz w:val="24"/>
+          <w:szCs w:val="28"/>
+          <w:highlight w:val="yellow"/>
+        </w:rPr>
+        <w:t>3. Resumen con restricciones de formato ("explícamelo como si tuviera 5 años")</w:t>
+      </w:r>
+    </w:p>
+    <w:p>
+      <w:proofErr w:type="spellStart"/>
+      <w:r>
+        <w:rPr>
+          <w:b/>
+          <w:bCs/>
+        </w:rPr>
+        <w:t>system_prompt</w:t>
+      </w:r>
+      <w:proofErr w:type="spellEnd"/>
+      <w:r>
+        <w:rPr>
+          <w:b/>
+          <w:bCs/>
+        </w:rPr>
+        <w:t>:</w:t>
+      </w:r>
+      <w:r>
+        <w:t xml:space="preserve"> "</w:t>
+      </w:r>
+      <w:proofErr w:type="spellStart"/>
+      <w:r>
+        <w:t>Explicá</w:t>
+      </w:r>
+      <w:proofErr w:type="spellEnd"/>
+      <w:r>
+        <w:t xml:space="preserve"> el siguiente texto técnico como si hablaras con alguien de 5 años, usando máximo 3 oraciones". </w:t>
+      </w:r>
+      <w:proofErr w:type="spellStart"/>
+      <w:r>
+        <w:rPr>
+          <w:b/>
+          <w:bCs/>
+        </w:rPr>
+        <w:t>user_prompt</w:t>
+      </w:r>
+      <w:proofErr w:type="spellEnd"/>
+      <w:r>
+        <w:rPr>
+          <w:b/>
+          <w:bCs/>
+        </w:rPr>
+        <w:t>:</w:t>
+      </w:r>
+      <w:r>
+        <w:t xml:space="preserve"> un párrafo técnico o científico complejo (por ejemplo, de Wikipedia).</w:t>
+      </w:r>
+    </w:p>
+    <w:p>
+      <w:r>
+        <w:rPr>
+          <w:b/>
+          <w:bCs/>
+        </w:rPr>
+        <w:t>Por qué es interesante:</w:t>
+      </w:r>
+      <w:r>
+        <w:t xml:space="preserve"> demuestra que agregar restricciones concretas (edad del público, cantidad de oraciones) al </w:t>
+      </w:r>
+      <w:proofErr w:type="spellStart"/>
+      <w:r>
+        <w:t>prompt</w:t>
+      </w:r>
+      <w:proofErr w:type="spellEnd"/>
+      <w:r>
+        <w:t xml:space="preserve"> mejora mucho la calidad del resultado, comparado con un simple "resumí esto".</w:t>
+      </w:r>
+    </w:p>
+    <w:p>
+      <w:pPr>
+        <w:rPr>
+          <w:b/>
+          <w:bCs/>
+          <w:sz w:val="24"/>
+          <w:szCs w:val="28"/>
+        </w:rPr>
+      </w:pPr>
+      <w:r>
+        <w:rPr>
+          <w:b/>
+          <w:bCs/>
+          <w:sz w:val="24"/>
+          <w:szCs w:val="28"/>
+          <w:highlight w:val="yellow"/>
+        </w:rPr>
+        <w:t xml:space="preserve">4. Clasificador de </w:t>
+      </w:r>
+      <w:proofErr w:type="gramStart"/>
+      <w:r>
+        <w:rPr>
+          <w:b/>
+          <w:bCs/>
+          <w:sz w:val="24"/>
+          <w:szCs w:val="28"/>
+          <w:highlight w:val="yellow"/>
+        </w:rPr>
+        <w:t>tickets</w:t>
+      </w:r>
+      <w:proofErr w:type="gramEnd"/>
+      <w:r>
+        <w:rPr>
+          <w:b/>
+          <w:bCs/>
+          <w:sz w:val="24"/>
+          <w:szCs w:val="28"/>
+          <w:highlight w:val="yellow"/>
+        </w:rPr>
+        <w:t xml:space="preserve"> de soporte</w:t>
+      </w:r>
+    </w:p>
+    <w:p>
+      <w:proofErr w:type="spellStart"/>
+      <w:r>
+        <w:rPr>
+          <w:b/>
+          <w:bCs/>
+        </w:rPr>
+        <w:t>system_prompt</w:t>
+      </w:r>
+      <w:proofErr w:type="spellEnd"/>
+      <w:r>
+        <w:rPr>
+          <w:b/>
+          <w:bCs/>
+        </w:rPr>
+        <w:t>:</w:t>
+      </w:r>
+      <w:r>
+        <w:t xml:space="preserve"> "</w:t>
+      </w:r>
+      <w:proofErr w:type="spellStart"/>
+      <w:r>
+        <w:t>Sos</w:t>
+      </w:r>
+      <w:proofErr w:type="spellEnd"/>
+      <w:r>
+        <w:t xml:space="preserve"> un clasificador que lee un </w:t>
+      </w:r>
+      <w:proofErr w:type="gramStart"/>
+      <w:r>
+        <w:t>ticket</w:t>
+      </w:r>
+      <w:proofErr w:type="gramEnd"/>
+      <w:r>
+        <w:t xml:space="preserve"> de soporte técnico y responde solo con una categoría: Facturación, Bug técnico, Consulta general o Urgente". </w:t>
+      </w:r>
+      <w:proofErr w:type="spellStart"/>
+      <w:r>
+        <w:rPr>
+          <w:b/>
+          <w:bCs/>
+        </w:rPr>
+        <w:t>user_prompt</w:t>
+      </w:r>
+      <w:proofErr w:type="spellEnd"/>
+      <w:r>
+        <w:rPr>
+          <w:b/>
+          <w:bCs/>
+        </w:rPr>
+        <w:t>:</w:t>
+      </w:r>
+      <w:r>
+        <w:t xml:space="preserve"> el texto de un </w:t>
+      </w:r>
+      <w:proofErr w:type="gramStart"/>
+      <w:r>
+        <w:t>ticket</w:t>
+      </w:r>
+      <w:proofErr w:type="gramEnd"/>
+      <w:r>
+        <w:t xml:space="preserve"> inventado o real (ej. "no puedo iniciar sesión desde ayer, ya reinicié todo").</w:t>
+      </w:r>
+    </w:p>
+    <w:p>
+      <w:r>
+        <w:rPr>
+          <w:b/>
+          <w:bCs/>
+        </w:rPr>
+        <w:t>Por qué es un buen ejercicio:</w:t>
+      </w:r>
+      <w:r>
+        <w:t xml:space="preserve"> introduce la idea de </w:t>
+      </w:r>
+      <w:r>
+        <w:rPr>
+          <w:b/>
+          <w:bCs/>
+        </w:rPr>
+        <w:t>clasificación</w:t>
+      </w:r>
+      <w:r>
+        <w:t xml:space="preserve"> (no solo resumen/generación) — pedirle al modelo que elija entre opciones fijas, útil como primer paso hacia lo que después será RAG y agentes en el curso.</w:t>
+      </w:r>
+    </w:p>
+    <w:p>
+      <w:pPr>
+        <w:rPr>
+          <w:b/>
+          <w:bCs/>
+          <w:sz w:val="24"/>
+          <w:szCs w:val="28"/>
+        </w:rPr>
+      </w:pPr>
+      <w:r>
+        <w:rPr>
+          <w:b/>
+          <w:bCs/>
+          <w:sz w:val="24"/>
+          <w:szCs w:val="28"/>
+          <w:highlight w:val="yellow"/>
+        </w:rPr>
+        <w:t>5. Traductor con tono personalizado</w:t>
+      </w:r>
+    </w:p>
+    <w:p>
+      <w:proofErr w:type="spellStart"/>
+      <w:r>
+        <w:rPr>
+          <w:b/>
+          <w:bCs/>
+        </w:rPr>
+        <w:t>system_prompt</w:t>
+      </w:r>
+      <w:proofErr w:type="spellEnd"/>
+      <w:r>
+        <w:rPr>
+          <w:b/>
+          <w:bCs/>
+        </w:rPr>
+        <w:t>:</w:t>
+      </w:r>
+      <w:r>
+        <w:t xml:space="preserve"> "</w:t>
+      </w:r>
+      <w:proofErr w:type="spellStart"/>
+      <w:r>
+        <w:t>Traducí</w:t>
+      </w:r>
+      <w:proofErr w:type="spellEnd"/>
+      <w:r>
+        <w:t xml:space="preserve"> el siguiente texto al español, pero con un tono informal y chileno (modismos incluidos)". </w:t>
+      </w:r>
+      <w:proofErr w:type="spellStart"/>
+      <w:r>
+        <w:t>user_prompt</w:t>
+      </w:r>
+      <w:proofErr w:type="spellEnd"/>
+      <w:r>
+        <w:t>: un párrafo en inglés (por ejemplo, un fragmento de una noticia).</w:t>
+      </w:r>
+    </w:p>
+    <w:p>
+      <w:pPr>
+        <w:pBdr>
+          <w:bottom w:val="single" w:sz="6" w:space="1" w:color="auto"/>
+        </w:pBdr>
+      </w:pPr>
+      <w:r>
+        <w:rPr>
+          <w:b/>
+          <w:bCs/>
+        </w:rPr>
+        <w:t>Por qué es divertido y educativo:</w:t>
+      </w:r>
+      <w:r>
+        <w:t xml:space="preserve"> el propio profesor menciona la traducción como ejemplo de variante en </w:t>
+      </w:r>
+      <w:proofErr w:type="spellStart"/>
+      <w:r>
+        <w:t>community-contributions</w:t>
+      </w:r>
+      <w:proofErr w:type="spellEnd"/>
+      <w:r>
+        <w:t xml:space="preserve"> — y permite ver claramente cómo un mismo texto cambia radicalmente de "personalidad" según las instrucciones del </w:t>
+      </w:r>
+      <w:proofErr w:type="spellStart"/>
+      <w:r>
+        <w:t>system</w:t>
+      </w:r>
+      <w:proofErr w:type="spellEnd"/>
+      <w:r>
+        <w:t xml:space="preserve"> </w:t>
+      </w:r>
+      <w:proofErr w:type="spellStart"/>
+      <w:r>
+        <w:t>prompt</w:t>
+      </w:r>
+      <w:proofErr w:type="spellEnd"/>
+      <w:r>
+        <w:t>, reforzando la lección central del día.</w:t>
+      </w:r>
+    </w:p>
+    <w:p>
+      <w:pPr>
+        <w:rPr>
+          <w:b/>
+          <w:bCs/>
+          <w:sz w:val="24"/>
+          <w:szCs w:val="28"/>
+        </w:rPr>
+      </w:pPr>
+      <w:r>
+        <w:rPr>
+          <w:b/>
+          <w:bCs/>
+          <w:sz w:val="24"/>
+          <w:szCs w:val="28"/>
+          <w:highlight w:val="yellow"/>
+        </w:rPr>
+        <w:t>Consejo general para cualquiera de estos desafíos</w:t>
+      </w:r>
+    </w:p>
+    <w:p>
+      <w:r>
+        <w:t xml:space="preserve">Según buenas prácticas de </w:t>
+      </w:r>
+      <w:proofErr w:type="spellStart"/>
+      <w:r>
+        <w:t>prompt</w:t>
+      </w:r>
+      <w:proofErr w:type="spellEnd"/>
+      <w:r>
+        <w:t xml:space="preserve"> </w:t>
+      </w:r>
+      <w:proofErr w:type="spellStart"/>
+      <w:r>
+        <w:t>engineering</w:t>
+      </w:r>
+      <w:proofErr w:type="spellEnd"/>
+      <w:r>
+        <w:t xml:space="preserve">: los mejores resultados salen cuando el </w:t>
+      </w:r>
+      <w:proofErr w:type="spellStart"/>
+      <w:r>
+        <w:t>system_prompt</w:t>
+      </w:r>
+      <w:proofErr w:type="spellEnd"/>
+      <w:r>
+        <w:t xml:space="preserve"> incluye </w:t>
+      </w:r>
+      <w:r>
+        <w:rPr>
+          <w:b/>
+          <w:bCs/>
+        </w:rPr>
+        <w:t>parámetros concretos y medibles</w:t>
+      </w:r>
+      <w:r>
+        <w:t xml:space="preserve"> (largo máximo, tono, formato de salida, público objetivo) en vez de instrucciones vagas tipo "</w:t>
+      </w:r>
+      <w:proofErr w:type="spellStart"/>
+      <w:r>
+        <w:t>hacelo</w:t>
+      </w:r>
+      <w:proofErr w:type="spellEnd"/>
+      <w:r>
+        <w:t xml:space="preserve"> bien". Por ejemplo, "resumí esto en 3 oraciones para un público general" funciona mejor que simplemente "resumí esto".</w:t>
+      </w:r>
+    </w:p>
+    <w:p/>
+    <w:p/>
+    <w:p/>
+    <w:p>
+      <w:pPr>
+        <w:rPr>
+          <w:b/>
+          <w:bCs/>
+        </w:rPr>
+      </w:pPr>
+    </w:p>
+    <w:p>
+      <w:pPr>
+        <w:rPr>
+          <w:b/>
+          <w:bCs/>
+        </w:rPr>
+      </w:pPr>
+    </w:p>
+    <w:p>
+      <w:pPr>
+        <w:rPr>
+          <w:b/>
+          <w:bCs/>
+        </w:rPr>
+      </w:pPr>
+    </w:p>
+    <w:p>
+      <w:pPr>
+        <w:rPr>
+          <w:b/>
+          <w:bCs/>
+        </w:rPr>
+      </w:pPr>
+    </w:p>
     <w:p/>
     <w:p/>
     <w:p/>
@@ -21397,6 +23139,95 @@
 <file path=word/numbering.xml><?xml version="1.0" encoding="utf-8"?>
 <w:numbering xmlns:wpc="http://schemas.microsoft.com/office/word/2010/wordprocessingCanvas" xmlns:cx="http://schemas.microsoft.com/office/drawing/2014/chartex" xmlns:cx1="http://schemas.microsoft.com/office/drawing/2015/9/8/chartex" xmlns:cx2="http://schemas.microsoft.com/office/drawing/2015/10/21/chartex" xmlns:cx3="http://schemas.microsoft.com/office/drawing/2016/5/9/chartex" xmlns:cx4="http://schemas.microsoft.com/office/drawing/2016/5/10/chartex" xmlns:cx5="http://schemas.microsoft.com/office/drawing/2016/5/11/chartex" xmlns:cx6="http://schemas.microsoft.com/office/drawing/2016/5/12/chartex" xmlns:cx7="http://schemas.microsoft.com/office/drawing/2016/5/13/chartex" xmlns:cx8="http://schemas.microsoft.com/office/drawing/2016/5/14/chartex" xmlns:mc="http://schemas.openxmlformats.org/markup-compatibility/2006" xmlns:aink="http://schemas.microsoft.com/office/drawing/2016/ink" xmlns:am3d="http://schemas.microsoft.com/office/drawing/2017/model3d" xmlns:o="urn:schemas-microsoft-com:office:office" xmlns:oel="http://schemas.microsoft.com/office/2019/extlst" xmlns:r="http://schemas.openxmlformats.org/officeDocument/2006/relationships" xmlns:m="http://schemas.openxmlformats.org/officeDocument/2006/math" xmlns:v="urn:schemas-microsoft-com:vml" xmlns:wp14="http://schemas.microsoft.com/office/word/2010/wordprocessingDrawing" xmlns:wp="http://schemas.openxmlformats.org/drawingml/2006/wordprocessingDrawing" xmlns:w10="urn:schemas-microsoft-com:office:word" xmlns:w="http://schemas.openxmlformats.org/wordprocessingml/2006/main" xmlns:w14="http://schemas.microsoft.com/office/word/2010/wordml" xmlns:w15="http://schemas.microsoft.com/office/word/2012/wordml" xmlns:w16cex="http://schemas.microsoft.com/office/word/2018/wordml/cex" xmlns:w16cid="http://schemas.microsoft.com/office/word/2016/wordml/cid" xmlns:w16="http://schemas.microsoft.com/office/word/2018/wordml" xmlns:w16du="http://schemas.microsoft.com/office/word/2023/wordml/word16du" xmlns:w16sdtdh="http://schemas.microsoft.com/office/word/2020/wordml/sdtdatahash" xmlns:w16sdtfl="http://schemas.microsoft.com/office/word/2024/wordml/sdtformatlock" xmlns:w16se="http://schemas.microsoft.com/office/word/2015/wordml/symex" xmlns:wpg="http://schemas.microsoft.com/office/word/2010/wordprocessingGroup" xmlns:wpi="http://schemas.microsoft.com/office/word/2010/wordprocessingInk" xmlns:wne="http://schemas.microsoft.com/office/word/2006/wordml" xmlns:wps="http://schemas.microsoft.com/office/word/2010/wordprocessingShape" mc:Ignorable="w14 w15 w16se w16cid w16 w16cex w16sdtdh w16sdtfl w16du wp14">
   <w:abstractNum w:abstractNumId="0" w15:restartNumberingAfterBreak="0">
+    <w:nsid w:val="03224EB7"/>
+    <w:multiLevelType w:val="hybridMultilevel"/>
+    <w:tmpl w:val="493E23AC"/>
+    <w:lvl w:ilvl="0" w:tplc="340A000F">
+      <w:start w:val="1"/>
+      <w:numFmt w:val="decimal"/>
+      <w:lvlText w:val="%1."/>
+      <w:lvlJc w:val="left"/>
+      <w:pPr>
+        <w:ind w:left="720" w:hanging="360"/>
+      </w:pPr>
+      <w:rPr>
+        <w:rFonts w:hint="default"/>
+      </w:rPr>
+    </w:lvl>
+    <w:lvl w:ilvl="1" w:tplc="340A0019" w:tentative="1">
+      <w:start w:val="1"/>
+      <w:numFmt w:val="lowerLetter"/>
+      <w:lvlText w:val="%2."/>
+      <w:lvlJc w:val="left"/>
+      <w:pPr>
+        <w:ind w:left="1440" w:hanging="360"/>
+      </w:pPr>
+    </w:lvl>
+    <w:lvl w:ilvl="2" w:tplc="340A001B" w:tentative="1">
+      <w:start w:val="1"/>
+      <w:numFmt w:val="lowerRoman"/>
+      <w:lvlText w:val="%3."/>
+      <w:lvlJc w:val="right"/>
+      <w:pPr>
+        <w:ind w:left="2160" w:hanging="180"/>
+      </w:pPr>
+    </w:lvl>
+    <w:lvl w:ilvl="3" w:tplc="340A000F" w:tentative="1">
+      <w:start w:val="1"/>
+      <w:numFmt w:val="decimal"/>
+      <w:lvlText w:val="%4."/>
+      <w:lvlJc w:val="left"/>
+      <w:pPr>
+        <w:ind w:left="2880" w:hanging="360"/>
+      </w:pPr>
+    </w:lvl>
+    <w:lvl w:ilvl="4" w:tplc="340A0019" w:tentative="1">
+      <w:start w:val="1"/>
+      <w:numFmt w:val="lowerLetter"/>
+      <w:lvlText w:val="%5."/>
+      <w:lvlJc w:val="left"/>
+      <w:pPr>
+        <w:ind w:left="3600" w:hanging="360"/>
+      </w:pPr>
+    </w:lvl>
+    <w:lvl w:ilvl="5" w:tplc="340A001B" w:tentative="1">
+      <w:start w:val="1"/>
+      <w:numFmt w:val="lowerRoman"/>
+      <w:lvlText w:val="%6."/>
+      <w:lvlJc w:val="right"/>
+      <w:pPr>
+        <w:ind w:left="4320" w:hanging="180"/>
+      </w:pPr>
+    </w:lvl>
+    <w:lvl w:ilvl="6" w:tplc="340A000F" w:tentative="1">
+      <w:start w:val="1"/>
+      <w:numFmt w:val="decimal"/>
+      <w:lvlText w:val="%7."/>
+      <w:lvlJc w:val="left"/>
+      <w:pPr>
+        <w:ind w:left="5040" w:hanging="360"/>
+      </w:pPr>
+    </w:lvl>
+    <w:lvl w:ilvl="7" w:tplc="340A0019" w:tentative="1">
+      <w:start w:val="1"/>
+      <w:numFmt w:val="lowerLetter"/>
+      <w:lvlText w:val="%8."/>
+      <w:lvlJc w:val="left"/>
+      <w:pPr>
+        <w:ind w:left="5760" w:hanging="360"/>
+      </w:pPr>
+    </w:lvl>
+    <w:lvl w:ilvl="8" w:tplc="340A001B" w:tentative="1">
+      <w:start w:val="1"/>
+      <w:numFmt w:val="lowerRoman"/>
+      <w:lvlText w:val="%9."/>
+      <w:lvlJc w:val="right"/>
+      <w:pPr>
+        <w:ind w:left="6480" w:hanging="180"/>
+      </w:pPr>
+    </w:lvl>
+  </w:abstractNum>
+  <w:abstractNum w:abstractNumId="1" w15:restartNumberingAfterBreak="0">
     <w:nsid w:val="0517734C"/>
     <w:multiLevelType w:val="multilevel"/>
     <w:tmpl w:val="04FCBA96"/>
@@ -21509,7 +23340,7 @@
       </w:rPr>
     </w:lvl>
   </w:abstractNum>
-  <w:abstractNum w:abstractNumId="1" w15:restartNumberingAfterBreak="0">
+  <w:abstractNum w:abstractNumId="2" w15:restartNumberingAfterBreak="0">
     <w:nsid w:val="0BAD2BFC"/>
     <w:multiLevelType w:val="multilevel"/>
     <w:tmpl w:val="18A24FE2"/>
@@ -21658,7 +23489,7 @@
       </w:rPr>
     </w:lvl>
   </w:abstractNum>
-  <w:abstractNum w:abstractNumId="2" w15:restartNumberingAfterBreak="0">
+  <w:abstractNum w:abstractNumId="3" w15:restartNumberingAfterBreak="0">
     <w:nsid w:val="0CC80EE7"/>
     <w:multiLevelType w:val="multilevel"/>
     <w:tmpl w:val="AA32D91A"/>
@@ -21771,7 +23602,7 @@
       </w:pPr>
     </w:lvl>
   </w:abstractNum>
-  <w:abstractNum w:abstractNumId="3" w15:restartNumberingAfterBreak="0">
+  <w:abstractNum w:abstractNumId="4" w15:restartNumberingAfterBreak="0">
     <w:nsid w:val="154C2685"/>
     <w:multiLevelType w:val="hybridMultilevel"/>
     <w:tmpl w:val="0C0C9B22"/>
@@ -21884,7 +23715,7 @@
       </w:rPr>
     </w:lvl>
   </w:abstractNum>
-  <w:abstractNum w:abstractNumId="4" w15:restartNumberingAfterBreak="0">
+  <w:abstractNum w:abstractNumId="5" w15:restartNumberingAfterBreak="0">
     <w:nsid w:val="1D5A35D7"/>
     <w:multiLevelType w:val="multilevel"/>
     <w:tmpl w:val="7A56AFD8"/>
@@ -22033,7 +23864,96 @@
       </w:rPr>
     </w:lvl>
   </w:abstractNum>
-  <w:abstractNum w:abstractNumId="5" w15:restartNumberingAfterBreak="0">
+  <w:abstractNum w:abstractNumId="6" w15:restartNumberingAfterBreak="0">
+    <w:nsid w:val="1F5378E9"/>
+    <w:multiLevelType w:val="hybridMultilevel"/>
+    <w:tmpl w:val="E088698E"/>
+    <w:lvl w:ilvl="0" w:tplc="340A000F">
+      <w:start w:val="1"/>
+      <w:numFmt w:val="decimal"/>
+      <w:lvlText w:val="%1."/>
+      <w:lvlJc w:val="left"/>
+      <w:pPr>
+        <w:ind w:left="720" w:hanging="360"/>
+      </w:pPr>
+      <w:rPr>
+        <w:rFonts w:hint="default"/>
+      </w:rPr>
+    </w:lvl>
+    <w:lvl w:ilvl="1" w:tplc="340A0019" w:tentative="1">
+      <w:start w:val="1"/>
+      <w:numFmt w:val="lowerLetter"/>
+      <w:lvlText w:val="%2."/>
+      <w:lvlJc w:val="left"/>
+      <w:pPr>
+        <w:ind w:left="1440" w:hanging="360"/>
+      </w:pPr>
+    </w:lvl>
+    <w:lvl w:ilvl="2" w:tplc="340A001B" w:tentative="1">
+      <w:start w:val="1"/>
+      <w:numFmt w:val="lowerRoman"/>
+      <w:lvlText w:val="%3."/>
+      <w:lvlJc w:val="right"/>
+      <w:pPr>
+        <w:ind w:left="2160" w:hanging="180"/>
+      </w:pPr>
+    </w:lvl>
+    <w:lvl w:ilvl="3" w:tplc="340A000F" w:tentative="1">
+      <w:start w:val="1"/>
+      <w:numFmt w:val="decimal"/>
+      <w:lvlText w:val="%4."/>
+      <w:lvlJc w:val="left"/>
+      <w:pPr>
+        <w:ind w:left="2880" w:hanging="360"/>
+      </w:pPr>
+    </w:lvl>
+    <w:lvl w:ilvl="4" w:tplc="340A0019" w:tentative="1">
+      <w:start w:val="1"/>
+      <w:numFmt w:val="lowerLetter"/>
+      <w:lvlText w:val="%5."/>
+      <w:lvlJc w:val="left"/>
+      <w:pPr>
+        <w:ind w:left="3600" w:hanging="360"/>
+      </w:pPr>
+    </w:lvl>
+    <w:lvl w:ilvl="5" w:tplc="340A001B" w:tentative="1">
+      <w:start w:val="1"/>
+      <w:numFmt w:val="lowerRoman"/>
+      <w:lvlText w:val="%6."/>
+      <w:lvlJc w:val="right"/>
+      <w:pPr>
+        <w:ind w:left="4320" w:hanging="180"/>
+      </w:pPr>
+    </w:lvl>
+    <w:lvl w:ilvl="6" w:tplc="340A000F" w:tentative="1">
+      <w:start w:val="1"/>
+      <w:numFmt w:val="decimal"/>
+      <w:lvlText w:val="%7."/>
+      <w:lvlJc w:val="left"/>
+      <w:pPr>
+        <w:ind w:left="5040" w:hanging="360"/>
+      </w:pPr>
+    </w:lvl>
+    <w:lvl w:ilvl="7" w:tplc="340A0019" w:tentative="1">
+      <w:start w:val="1"/>
+      <w:numFmt w:val="lowerLetter"/>
+      <w:lvlText w:val="%8."/>
+      <w:lvlJc w:val="left"/>
+      <w:pPr>
+        <w:ind w:left="5760" w:hanging="360"/>
+      </w:pPr>
+    </w:lvl>
+    <w:lvl w:ilvl="8" w:tplc="340A001B" w:tentative="1">
+      <w:start w:val="1"/>
+      <w:numFmt w:val="lowerRoman"/>
+      <w:lvlText w:val="%9."/>
+      <w:lvlJc w:val="right"/>
+      <w:pPr>
+        <w:ind w:left="6480" w:hanging="180"/>
+      </w:pPr>
+    </w:lvl>
+  </w:abstractNum>
+  <w:abstractNum w:abstractNumId="7" w15:restartNumberingAfterBreak="0">
     <w:nsid w:val="210F7B87"/>
     <w:multiLevelType w:val="multilevel"/>
     <w:tmpl w:val="7BC8306E"/>
@@ -22182,7 +24102,7 @@
       </w:rPr>
     </w:lvl>
   </w:abstractNum>
-  <w:abstractNum w:abstractNumId="6" w15:restartNumberingAfterBreak="0">
+  <w:abstractNum w:abstractNumId="8" w15:restartNumberingAfterBreak="0">
     <w:nsid w:val="289F17F9"/>
     <w:multiLevelType w:val="hybridMultilevel"/>
     <w:tmpl w:val="4208863C"/>
@@ -22271,7 +24191,7 @@
       </w:pPr>
     </w:lvl>
   </w:abstractNum>
-  <w:abstractNum w:abstractNumId="7" w15:restartNumberingAfterBreak="0">
+  <w:abstractNum w:abstractNumId="9" w15:restartNumberingAfterBreak="0">
     <w:nsid w:val="2D5C6B5A"/>
     <w:multiLevelType w:val="multilevel"/>
     <w:tmpl w:val="6CD4884E"/>
@@ -22420,7 +24340,7 @@
       </w:rPr>
     </w:lvl>
   </w:abstractNum>
-  <w:abstractNum w:abstractNumId="8" w15:restartNumberingAfterBreak="0">
+  <w:abstractNum w:abstractNumId="10" w15:restartNumberingAfterBreak="0">
     <w:nsid w:val="2F806F87"/>
     <w:multiLevelType w:val="multilevel"/>
     <w:tmpl w:val="D2A81D56"/>
@@ -22569,7 +24489,156 @@
       </w:rPr>
     </w:lvl>
   </w:abstractNum>
-  <w:abstractNum w:abstractNumId="9" w15:restartNumberingAfterBreak="0">
+  <w:abstractNum w:abstractNumId="11" w15:restartNumberingAfterBreak="0">
+    <w:nsid w:val="3721372D"/>
+    <w:multiLevelType w:val="multilevel"/>
+    <w:tmpl w:val="13726C4C"/>
+    <w:lvl w:ilvl="0">
+      <w:start w:val="1"/>
+      <w:numFmt w:val="bullet"/>
+      <w:lvlText w:val=""/>
+      <w:lvlJc w:val="left"/>
+      <w:pPr>
+        <w:tabs>
+          <w:tab w:val="num" w:pos="720"/>
+        </w:tabs>
+        <w:ind w:left="720" w:hanging="360"/>
+      </w:pPr>
+      <w:rPr>
+        <w:rFonts w:ascii="Symbol" w:hAnsi="Symbol" w:hint="default"/>
+        <w:sz w:val="20"/>
+      </w:rPr>
+    </w:lvl>
+    <w:lvl w:ilvl="1" w:tentative="1">
+      <w:start w:val="1"/>
+      <w:numFmt w:val="bullet"/>
+      <w:lvlText w:val="o"/>
+      <w:lvlJc w:val="left"/>
+      <w:pPr>
+        <w:tabs>
+          <w:tab w:val="num" w:pos="1440"/>
+        </w:tabs>
+        <w:ind w:left="1440" w:hanging="360"/>
+      </w:pPr>
+      <w:rPr>
+        <w:rFonts w:ascii="Courier New" w:hAnsi="Courier New" w:hint="default"/>
+        <w:sz w:val="20"/>
+      </w:rPr>
+    </w:lvl>
+    <w:lvl w:ilvl="2" w:tentative="1">
+      <w:start w:val="1"/>
+      <w:numFmt w:val="bullet"/>
+      <w:lvlText w:val=""/>
+      <w:lvlJc w:val="left"/>
+      <w:pPr>
+        <w:tabs>
+          <w:tab w:val="num" w:pos="2160"/>
+        </w:tabs>
+        <w:ind w:left="2160" w:hanging="360"/>
+      </w:pPr>
+      <w:rPr>
+        <w:rFonts w:ascii="Wingdings" w:hAnsi="Wingdings" w:hint="default"/>
+        <w:sz w:val="20"/>
+      </w:rPr>
+    </w:lvl>
+    <w:lvl w:ilvl="3" w:tentative="1">
+      <w:start w:val="1"/>
+      <w:numFmt w:val="bullet"/>
+      <w:lvlText w:val=""/>
+      <w:lvlJc w:val="left"/>
+      <w:pPr>
+        <w:tabs>
+          <w:tab w:val="num" w:pos="2880"/>
+        </w:tabs>
+        <w:ind w:left="2880" w:hanging="360"/>
+      </w:pPr>
+      <w:rPr>
+        <w:rFonts w:ascii="Wingdings" w:hAnsi="Wingdings" w:hint="default"/>
+        <w:sz w:val="20"/>
+      </w:rPr>
+    </w:lvl>
+    <w:lvl w:ilvl="4" w:tentative="1">
+      <w:start w:val="1"/>
+      <w:numFmt w:val="bullet"/>
+      <w:lvlText w:val=""/>
+      <w:lvlJc w:val="left"/>
+      <w:pPr>
+        <w:tabs>
+          <w:tab w:val="num" w:pos="3600"/>
+        </w:tabs>
+        <w:ind w:left="3600" w:hanging="360"/>
+      </w:pPr>
+      <w:rPr>
+        <w:rFonts w:ascii="Wingdings" w:hAnsi="Wingdings" w:hint="default"/>
+        <w:sz w:val="20"/>
+      </w:rPr>
+    </w:lvl>
+    <w:lvl w:ilvl="5" w:tentative="1">
+      <w:start w:val="1"/>
+      <w:numFmt w:val="bullet"/>
+      <w:lvlText w:val=""/>
+      <w:lvlJc w:val="left"/>
+      <w:pPr>
+        <w:tabs>
+          <w:tab w:val="num" w:pos="4320"/>
+        </w:tabs>
+        <w:ind w:left="4320" w:hanging="360"/>
+      </w:pPr>
+      <w:rPr>
+        <w:rFonts w:ascii="Wingdings" w:hAnsi="Wingdings" w:hint="default"/>
+        <w:sz w:val="20"/>
+      </w:rPr>
+    </w:lvl>
+    <w:lvl w:ilvl="6" w:tentative="1">
+      <w:start w:val="1"/>
+      <w:numFmt w:val="bullet"/>
+      <w:lvlText w:val=""/>
+      <w:lvlJc w:val="left"/>
+      <w:pPr>
+        <w:tabs>
+          <w:tab w:val="num" w:pos="5040"/>
+        </w:tabs>
+        <w:ind w:left="5040" w:hanging="360"/>
+      </w:pPr>
+      <w:rPr>
+        <w:rFonts w:ascii="Wingdings" w:hAnsi="Wingdings" w:hint="default"/>
+        <w:sz w:val="20"/>
+      </w:rPr>
+    </w:lvl>
+    <w:lvl w:ilvl="7" w:tentative="1">
+      <w:start w:val="1"/>
+      <w:numFmt w:val="bullet"/>
+      <w:lvlText w:val=""/>
+      <w:lvlJc w:val="left"/>
+      <w:pPr>
+        <w:tabs>
+          <w:tab w:val="num" w:pos="5760"/>
+        </w:tabs>
+        <w:ind w:left="5760" w:hanging="360"/>
+      </w:pPr>
+      <w:rPr>
+        <w:rFonts w:ascii="Wingdings" w:hAnsi="Wingdings" w:hint="default"/>
+        <w:sz w:val="20"/>
+      </w:rPr>
+    </w:lvl>
+    <w:lvl w:ilvl="8" w:tentative="1">
+      <w:start w:val="1"/>
+      <w:numFmt w:val="bullet"/>
+      <w:lvlText w:val=""/>
+      <w:lvlJc w:val="left"/>
+      <w:pPr>
+        <w:tabs>
+          <w:tab w:val="num" w:pos="6480"/>
+        </w:tabs>
+        <w:ind w:left="6480" w:hanging="360"/>
+      </w:pPr>
+      <w:rPr>
+        <w:rFonts w:ascii="Wingdings" w:hAnsi="Wingdings" w:hint="default"/>
+        <w:sz w:val="20"/>
+      </w:rPr>
+    </w:lvl>
+  </w:abstractNum>
+  <w:abstractNum w:abstractNumId="12" w15:restartNumberingAfterBreak="0">
     <w:nsid w:val="39954E22"/>
     <w:multiLevelType w:val="multilevel"/>
     <w:tmpl w:val="889440C2"/>
@@ -22718,7 +24787,156 @@
       </w:rPr>
     </w:lvl>
   </w:abstractNum>
-  <w:abstractNum w:abstractNumId="10" w15:restartNumberingAfterBreak="0">
+  <w:abstractNum w:abstractNumId="13" w15:restartNumberingAfterBreak="0">
+    <w:nsid w:val="3DD847E6"/>
+    <w:multiLevelType w:val="multilevel"/>
+    <w:tmpl w:val="E9B08924"/>
+    <w:lvl w:ilvl="0">
+      <w:start w:val="1"/>
+      <w:numFmt w:val="bullet"/>
+      <w:lvlText w:val=""/>
+      <w:lvlJc w:val="left"/>
+      <w:pPr>
+        <w:tabs>
+          <w:tab w:val="num" w:pos="720"/>
+        </w:tabs>
+        <w:ind w:left="720" w:hanging="360"/>
+      </w:pPr>
+      <w:rPr>
+        <w:rFonts w:ascii="Symbol" w:hAnsi="Symbol" w:hint="default"/>
+        <w:sz w:val="20"/>
+      </w:rPr>
+    </w:lvl>
+    <w:lvl w:ilvl="1" w:tentative="1">
+      <w:start w:val="1"/>
+      <w:numFmt w:val="bullet"/>
+      <w:lvlText w:val="o"/>
+      <w:lvlJc w:val="left"/>
+      <w:pPr>
+        <w:tabs>
+          <w:tab w:val="num" w:pos="1440"/>
+        </w:tabs>
+        <w:ind w:left="1440" w:hanging="360"/>
+      </w:pPr>
+      <w:rPr>
+        <w:rFonts w:ascii="Courier New" w:hAnsi="Courier New" w:hint="default"/>
+        <w:sz w:val="20"/>
+      </w:rPr>
+    </w:lvl>
+    <w:lvl w:ilvl="2" w:tentative="1">
+      <w:start w:val="1"/>
+      <w:numFmt w:val="bullet"/>
+      <w:lvlText w:val=""/>
+      <w:lvlJc w:val="left"/>
+      <w:pPr>
+        <w:tabs>
+          <w:tab w:val="num" w:pos="2160"/>
+        </w:tabs>
+        <w:ind w:left="2160" w:hanging="360"/>
+      </w:pPr>
+      <w:rPr>
+        <w:rFonts w:ascii="Wingdings" w:hAnsi="Wingdings" w:hint="default"/>
+        <w:sz w:val="20"/>
+      </w:rPr>
+    </w:lvl>
+    <w:lvl w:ilvl="3" w:tentative="1">
+      <w:start w:val="1"/>
+      <w:numFmt w:val="bullet"/>
+      <w:lvlText w:val=""/>
+      <w:lvlJc w:val="left"/>
+      <w:pPr>
+        <w:tabs>
+          <w:tab w:val="num" w:pos="2880"/>
+        </w:tabs>
+        <w:ind w:left="2880" w:hanging="360"/>
+      </w:pPr>
+      <w:rPr>
+        <w:rFonts w:ascii="Wingdings" w:hAnsi="Wingdings" w:hint="default"/>
+        <w:sz w:val="20"/>
+      </w:rPr>
+    </w:lvl>
+    <w:lvl w:ilvl="4" w:tentative="1">
+      <w:start w:val="1"/>
+      <w:numFmt w:val="bullet"/>
+      <w:lvlText w:val=""/>
+      <w:lvlJc w:val="left"/>
+      <w:pPr>
+        <w:tabs>
+          <w:tab w:val="num" w:pos="3600"/>
+        </w:tabs>
+        <w:ind w:left="3600" w:hanging="360"/>
+      </w:pPr>
+      <w:rPr>
+        <w:rFonts w:ascii="Wingdings" w:hAnsi="Wingdings" w:hint="default"/>
+        <w:sz w:val="20"/>
+      </w:rPr>
+    </w:lvl>
+    <w:lvl w:ilvl="5" w:tentative="1">
+      <w:start w:val="1"/>
+      <w:numFmt w:val="bullet"/>
+      <w:lvlText w:val=""/>
+      <w:lvlJc w:val="left"/>
+      <w:pPr>
+        <w:tabs>
+          <w:tab w:val="num" w:pos="4320"/>
+        </w:tabs>
+        <w:ind w:left="4320" w:hanging="360"/>
+      </w:pPr>
+      <w:rPr>
+        <w:rFonts w:ascii="Wingdings" w:hAnsi="Wingdings" w:hint="default"/>
+        <w:sz w:val="20"/>
+      </w:rPr>
+    </w:lvl>
+    <w:lvl w:ilvl="6" w:tentative="1">
+      <w:start w:val="1"/>
+      <w:numFmt w:val="bullet"/>
+      <w:lvlText w:val=""/>
+      <w:lvlJc w:val="left"/>
+      <w:pPr>
+        <w:tabs>
+          <w:tab w:val="num" w:pos="5040"/>
+        </w:tabs>
+        <w:ind w:left="5040" w:hanging="360"/>
+      </w:pPr>
+      <w:rPr>
+        <w:rFonts w:ascii="Wingdings" w:hAnsi="Wingdings" w:hint="default"/>
+        <w:sz w:val="20"/>
+      </w:rPr>
+    </w:lvl>
+    <w:lvl w:ilvl="7" w:tentative="1">
+      <w:start w:val="1"/>
+      <w:numFmt w:val="bullet"/>
+      <w:lvlText w:val=""/>
+      <w:lvlJc w:val="left"/>
+      <w:pPr>
+        <w:tabs>
+          <w:tab w:val="num" w:pos="5760"/>
+        </w:tabs>
+        <w:ind w:left="5760" w:hanging="360"/>
+      </w:pPr>
+      <w:rPr>
+        <w:rFonts w:ascii="Wingdings" w:hAnsi="Wingdings" w:hint="default"/>
+        <w:sz w:val="20"/>
+      </w:rPr>
+    </w:lvl>
+    <w:lvl w:ilvl="8" w:tentative="1">
+      <w:start w:val="1"/>
+      <w:numFmt w:val="bullet"/>
+      <w:lvlText w:val=""/>
+      <w:lvlJc w:val="left"/>
+      <w:pPr>
+        <w:tabs>
+          <w:tab w:val="num" w:pos="6480"/>
+        </w:tabs>
+        <w:ind w:left="6480" w:hanging="360"/>
+      </w:pPr>
+      <w:rPr>
+        <w:rFonts w:ascii="Wingdings" w:hAnsi="Wingdings" w:hint="default"/>
+        <w:sz w:val="20"/>
+      </w:rPr>
+    </w:lvl>
+  </w:abstractNum>
+  <w:abstractNum w:abstractNumId="14" w15:restartNumberingAfterBreak="0">
     <w:nsid w:val="443735ED"/>
     <w:multiLevelType w:val="multilevel"/>
     <w:tmpl w:val="2C423B9C"/>
@@ -22831,7 +25049,7 @@
       </w:rPr>
     </w:lvl>
   </w:abstractNum>
-  <w:abstractNum w:abstractNumId="11" w15:restartNumberingAfterBreak="0">
+  <w:abstractNum w:abstractNumId="15" w15:restartNumberingAfterBreak="0">
     <w:nsid w:val="44C57172"/>
     <w:multiLevelType w:val="multilevel"/>
     <w:tmpl w:val="F6FE394E"/>
@@ -22944,7 +25162,7 @@
       </w:pPr>
     </w:lvl>
   </w:abstractNum>
-  <w:abstractNum w:abstractNumId="12" w15:restartNumberingAfterBreak="0">
+  <w:abstractNum w:abstractNumId="16" w15:restartNumberingAfterBreak="0">
     <w:nsid w:val="482D37C4"/>
     <w:multiLevelType w:val="multilevel"/>
     <w:tmpl w:val="2C423B9C"/>
@@ -23057,7 +25275,7 @@
       </w:rPr>
     </w:lvl>
   </w:abstractNum>
-  <w:abstractNum w:abstractNumId="13" w15:restartNumberingAfterBreak="0">
+  <w:abstractNum w:abstractNumId="17" w15:restartNumberingAfterBreak="0">
     <w:nsid w:val="49421D00"/>
     <w:multiLevelType w:val="multilevel"/>
     <w:tmpl w:val="7E6ED63C"/>
@@ -23170,7 +25388,7 @@
       </w:rPr>
     </w:lvl>
   </w:abstractNum>
-  <w:abstractNum w:abstractNumId="14" w15:restartNumberingAfterBreak="0">
+  <w:abstractNum w:abstractNumId="18" w15:restartNumberingAfterBreak="0">
     <w:nsid w:val="4CAD596E"/>
     <w:multiLevelType w:val="multilevel"/>
     <w:tmpl w:val="501C94C8"/>
@@ -23319,7 +25537,120 @@
       </w:rPr>
     </w:lvl>
   </w:abstractNum>
-  <w:abstractNum w:abstractNumId="15" w15:restartNumberingAfterBreak="0">
+  <w:abstractNum w:abstractNumId="19" w15:restartNumberingAfterBreak="0">
+    <w:nsid w:val="516B4C43"/>
+    <w:multiLevelType w:val="multilevel"/>
+    <w:tmpl w:val="C2247296"/>
+    <w:lvl w:ilvl="0">
+      <w:start w:val="1"/>
+      <w:numFmt w:val="decimal"/>
+      <w:lvlText w:val="%1."/>
+      <w:lvlJc w:val="left"/>
+      <w:pPr>
+        <w:tabs>
+          <w:tab w:val="num" w:pos="720"/>
+        </w:tabs>
+        <w:ind w:left="720" w:hanging="360"/>
+      </w:pPr>
+    </w:lvl>
+    <w:lvl w:ilvl="1" w:tentative="1">
+      <w:start w:val="1"/>
+      <w:numFmt w:val="decimal"/>
+      <w:lvlText w:val="%2."/>
+      <w:lvlJc w:val="left"/>
+      <w:pPr>
+        <w:tabs>
+          <w:tab w:val="num" w:pos="1440"/>
+        </w:tabs>
+        <w:ind w:left="1440" w:hanging="360"/>
+      </w:pPr>
+    </w:lvl>
+    <w:lvl w:ilvl="2" w:tentative="1">
+      <w:start w:val="1"/>
+      <w:numFmt w:val="decimal"/>
+      <w:lvlText w:val="%3."/>
+      <w:lvlJc w:val="left"/>
+      <w:pPr>
+        <w:tabs>
+          <w:tab w:val="num" w:pos="2160"/>
+        </w:tabs>
+        <w:ind w:left="2160" w:hanging="360"/>
+      </w:pPr>
+    </w:lvl>
+    <w:lvl w:ilvl="3" w:tentative="1">
+      <w:start w:val="1"/>
+      <w:numFmt w:val="decimal"/>
+      <w:lvlText w:val="%4."/>
+      <w:lvlJc w:val="left"/>
+      <w:pPr>
+        <w:tabs>
+          <w:tab w:val="num" w:pos="2880"/>
+        </w:tabs>
+        <w:ind w:left="2880" w:hanging="360"/>
+      </w:pPr>
+    </w:lvl>
+    <w:lvl w:ilvl="4" w:tentative="1">
+      <w:start w:val="1"/>
+      <w:numFmt w:val="decimal"/>
+      <w:lvlText w:val="%5."/>
+      <w:lvlJc w:val="left"/>
+      <w:pPr>
+        <w:tabs>
+          <w:tab w:val="num" w:pos="3600"/>
+        </w:tabs>
+        <w:ind w:left="3600" w:hanging="360"/>
+      </w:pPr>
+    </w:lvl>
+    <w:lvl w:ilvl="5" w:tentative="1">
+      <w:start w:val="1"/>
+      <w:numFmt w:val="decimal"/>
+      <w:lvlText w:val="%6."/>
+      <w:lvlJc w:val="left"/>
+      <w:pPr>
+        <w:tabs>
+          <w:tab w:val="num" w:pos="4320"/>
+        </w:tabs>
+        <w:ind w:left="4320" w:hanging="360"/>
+      </w:pPr>
+    </w:lvl>
+    <w:lvl w:ilvl="6" w:tentative="1">
+      <w:start w:val="1"/>
+      <w:numFmt w:val="decimal"/>
+      <w:lvlText w:val="%7."/>
+      <w:lvlJc w:val="left"/>
+      <w:pPr>
+        <w:tabs>
+          <w:tab w:val="num" w:pos="5040"/>
+        </w:tabs>
+        <w:ind w:left="5040" w:hanging="360"/>
+      </w:pPr>
+    </w:lvl>
+    <w:lvl w:ilvl="7" w:tentative="1">
+      <w:start w:val="1"/>
+      <w:numFmt w:val="decimal"/>
+      <w:lvlText w:val="%8."/>
+      <w:lvlJc w:val="left"/>
+      <w:pPr>
+        <w:tabs>
+          <w:tab w:val="num" w:pos="5760"/>
+        </w:tabs>
+        <w:ind w:left="5760" w:hanging="360"/>
+      </w:pPr>
+    </w:lvl>
+    <w:lvl w:ilvl="8" w:tentative="1">
+      <w:start w:val="1"/>
+      <w:numFmt w:val="decimal"/>
+      <w:lvlText w:val="%9."/>
+      <w:lvlJc w:val="left"/>
+      <w:pPr>
+        <w:tabs>
+          <w:tab w:val="num" w:pos="6480"/>
+        </w:tabs>
+        <w:ind w:left="6480" w:hanging="360"/>
+      </w:pPr>
+    </w:lvl>
+  </w:abstractNum>
+  <w:abstractNum w:abstractNumId="20" w15:restartNumberingAfterBreak="0">
     <w:nsid w:val="56530035"/>
     <w:multiLevelType w:val="multilevel"/>
     <w:tmpl w:val="7E6ED63C"/>
@@ -23432,7 +25763,7 @@
       </w:rPr>
     </w:lvl>
   </w:abstractNum>
-  <w:abstractNum w:abstractNumId="16" w15:restartNumberingAfterBreak="0">
+  <w:abstractNum w:abstractNumId="21" w15:restartNumberingAfterBreak="0">
     <w:nsid w:val="586E4463"/>
     <w:multiLevelType w:val="multilevel"/>
     <w:tmpl w:val="8CFAF102"/>
@@ -23581,7 +25912,7 @@
       </w:rPr>
     </w:lvl>
   </w:abstractNum>
-  <w:abstractNum w:abstractNumId="17" w15:restartNumberingAfterBreak="0">
+  <w:abstractNum w:abstractNumId="22" w15:restartNumberingAfterBreak="0">
     <w:nsid w:val="593354CB"/>
     <w:multiLevelType w:val="multilevel"/>
     <w:tmpl w:val="5C6E5828"/>
@@ -23730,7 +26061,7 @@
       </w:rPr>
     </w:lvl>
   </w:abstractNum>
-  <w:abstractNum w:abstractNumId="18" w15:restartNumberingAfterBreak="0">
+  <w:abstractNum w:abstractNumId="23" w15:restartNumberingAfterBreak="0">
     <w:nsid w:val="64D930DA"/>
     <w:multiLevelType w:val="hybridMultilevel"/>
     <w:tmpl w:val="99FE286C"/>
@@ -23843,7 +26174,7 @@
       </w:rPr>
     </w:lvl>
   </w:abstractNum>
-  <w:abstractNum w:abstractNumId="19" w15:restartNumberingAfterBreak="0">
+  <w:abstractNum w:abstractNumId="24" w15:restartNumberingAfterBreak="0">
     <w:nsid w:val="652048AA"/>
     <w:multiLevelType w:val="multilevel"/>
     <w:tmpl w:val="D4D21A42"/>
@@ -23992,7 +26323,7 @@
       </w:rPr>
     </w:lvl>
   </w:abstractNum>
-  <w:abstractNum w:abstractNumId="20" w15:restartNumberingAfterBreak="0">
+  <w:abstractNum w:abstractNumId="25" w15:restartNumberingAfterBreak="0">
     <w:nsid w:val="678F2CBA"/>
     <w:multiLevelType w:val="hybridMultilevel"/>
     <w:tmpl w:val="1C3C9D4A"/>
@@ -24081,7 +26412,7 @@
       </w:pPr>
     </w:lvl>
   </w:abstractNum>
-  <w:abstractNum w:abstractNumId="21" w15:restartNumberingAfterBreak="0">
+  <w:abstractNum w:abstractNumId="26" w15:restartNumberingAfterBreak="0">
     <w:nsid w:val="6CD57B01"/>
     <w:multiLevelType w:val="multilevel"/>
     <w:tmpl w:val="4BFC67A0"/>
@@ -24194,7 +26525,7 @@
       </w:pPr>
     </w:lvl>
   </w:abstractNum>
-  <w:abstractNum w:abstractNumId="22" w15:restartNumberingAfterBreak="0">
+  <w:abstractNum w:abstractNumId="27" w15:restartNumberingAfterBreak="0">
     <w:nsid w:val="6ED24662"/>
     <w:multiLevelType w:val="multilevel"/>
     <w:tmpl w:val="B7B2DC66"/>
@@ -24343,7 +26674,7 @@
       </w:rPr>
     </w:lvl>
   </w:abstractNum>
-  <w:abstractNum w:abstractNumId="23" w15:restartNumberingAfterBreak="0">
+  <w:abstractNum w:abstractNumId="28" w15:restartNumberingAfterBreak="0">
     <w:nsid w:val="707921DB"/>
     <w:multiLevelType w:val="hybridMultilevel"/>
     <w:tmpl w:val="94608ADC"/>
@@ -24456,7 +26787,7 @@
       </w:rPr>
     </w:lvl>
   </w:abstractNum>
-  <w:abstractNum w:abstractNumId="24" w15:restartNumberingAfterBreak="0">
+  <w:abstractNum w:abstractNumId="29" w15:restartNumberingAfterBreak="0">
     <w:nsid w:val="734F7C83"/>
     <w:multiLevelType w:val="multilevel"/>
     <w:tmpl w:val="1458E948"/>
@@ -24605,7 +26936,7 @@
       </w:rPr>
     </w:lvl>
   </w:abstractNum>
-  <w:abstractNum w:abstractNumId="25" w15:restartNumberingAfterBreak="0">
+  <w:abstractNum w:abstractNumId="30" w15:restartNumberingAfterBreak="0">
     <w:nsid w:val="748723AA"/>
     <w:multiLevelType w:val="multilevel"/>
     <w:tmpl w:val="CC2681A8"/>
@@ -24754,7 +27085,7 @@
       </w:rPr>
     </w:lvl>
   </w:abstractNum>
-  <w:abstractNum w:abstractNumId="26" w15:restartNumberingAfterBreak="0">
+  <w:abstractNum w:abstractNumId="31" w15:restartNumberingAfterBreak="0">
     <w:nsid w:val="772F1175"/>
     <w:multiLevelType w:val="multilevel"/>
     <w:tmpl w:val="E3502780"/>
@@ -24867,86 +27198,217 @@
       </w:rPr>
     </w:lvl>
   </w:abstractNum>
+  <w:abstractNum w:abstractNumId="32" w15:restartNumberingAfterBreak="0">
+    <w:nsid w:val="7BB24099"/>
+    <w:multiLevelType w:val="multilevel"/>
+    <w:tmpl w:val="E3502780"/>
+    <w:lvl w:ilvl="0">
+      <w:start w:val="1"/>
+      <w:numFmt w:val="decimal"/>
+      <w:lvlText w:val="%1"/>
+      <w:lvlJc w:val="left"/>
+      <w:pPr>
+        <w:ind w:left="540" w:hanging="540"/>
+      </w:pPr>
+      <w:rPr>
+        <w:rFonts w:hint="default"/>
+      </w:rPr>
+    </w:lvl>
+    <w:lvl w:ilvl="1">
+      <w:start w:val="5"/>
+      <w:numFmt w:val="decimal"/>
+      <w:lvlText w:val="%1.%2"/>
+      <w:lvlJc w:val="left"/>
+      <w:pPr>
+        <w:ind w:left="540" w:hanging="540"/>
+      </w:pPr>
+      <w:rPr>
+        <w:rFonts w:hint="default"/>
+      </w:rPr>
+    </w:lvl>
+    <w:lvl w:ilvl="2">
+      <w:start w:val="4"/>
+      <w:numFmt w:val="decimal"/>
+      <w:lvlText w:val="%1.%2.%3"/>
+      <w:lvlJc w:val="left"/>
+      <w:pPr>
+        <w:ind w:left="720" w:hanging="720"/>
+      </w:pPr>
+      <w:rPr>
+        <w:rFonts w:hint="default"/>
+      </w:rPr>
+    </w:lvl>
+    <w:lvl w:ilvl="3">
+      <w:start w:val="1"/>
+      <w:numFmt w:val="decimal"/>
+      <w:lvlText w:val="%1.%2.%3.%4"/>
+      <w:lvlJc w:val="left"/>
+      <w:pPr>
+        <w:ind w:left="720" w:hanging="720"/>
+      </w:pPr>
+      <w:rPr>
+        <w:rFonts w:hint="default"/>
+      </w:rPr>
+    </w:lvl>
+    <w:lvl w:ilvl="4">
+      <w:start w:val="1"/>
+      <w:numFmt w:val="decimal"/>
+      <w:lvlText w:val="%1.%2.%3.%4.%5"/>
+      <w:lvlJc w:val="left"/>
+      <w:pPr>
+        <w:ind w:left="1080" w:hanging="1080"/>
+      </w:pPr>
+      <w:rPr>
+        <w:rFonts w:hint="default"/>
+      </w:rPr>
+    </w:lvl>
+    <w:lvl w:ilvl="5">
+      <w:start w:val="1"/>
+      <w:numFmt w:val="decimal"/>
+      <w:lvlText w:val="%1.%2.%3.%4.%5.%6"/>
+      <w:lvlJc w:val="left"/>
+      <w:pPr>
+        <w:ind w:left="1080" w:hanging="1080"/>
+      </w:pPr>
+      <w:rPr>
+        <w:rFonts w:hint="default"/>
+      </w:rPr>
+    </w:lvl>
+    <w:lvl w:ilvl="6">
+      <w:start w:val="1"/>
+      <w:numFmt w:val="decimal"/>
+      <w:lvlText w:val="%1.%2.%3.%4.%5.%6.%7"/>
+      <w:lvlJc w:val="left"/>
+      <w:pPr>
+        <w:ind w:left="1440" w:hanging="1440"/>
+      </w:pPr>
+      <w:rPr>
+        <w:rFonts w:hint="default"/>
+      </w:rPr>
+    </w:lvl>
+    <w:lvl w:ilvl="7">
+      <w:start w:val="1"/>
+      <w:numFmt w:val="decimal"/>
+      <w:lvlText w:val="%1.%2.%3.%4.%5.%6.%7.%8"/>
+      <w:lvlJc w:val="left"/>
+      <w:pPr>
+        <w:ind w:left="1440" w:hanging="1440"/>
+      </w:pPr>
+      <w:rPr>
+        <w:rFonts w:hint="default"/>
+      </w:rPr>
+    </w:lvl>
+    <w:lvl w:ilvl="8">
+      <w:start w:val="1"/>
+      <w:numFmt w:val="decimal"/>
+      <w:lvlText w:val="%1.%2.%3.%4.%5.%6.%7.%8.%9"/>
+      <w:lvlJc w:val="left"/>
+      <w:pPr>
+        <w:ind w:left="1800" w:hanging="1800"/>
+      </w:pPr>
+      <w:rPr>
+        <w:rFonts w:hint="default"/>
+      </w:rPr>
+    </w:lvl>
+  </w:abstractNum>
   <w:num w:numId="1" w16cid:durableId="1550147440">
+    <w:abstractNumId w:val="8"/>
+  </w:num>
+  <w:num w:numId="2" w16cid:durableId="418252928">
+    <w:abstractNumId w:val="18"/>
+  </w:num>
+  <w:num w:numId="3" w16cid:durableId="1015575208">
+    <w:abstractNumId w:val="28"/>
+  </w:num>
+  <w:num w:numId="4" w16cid:durableId="2000500593">
+    <w:abstractNumId w:val="15"/>
+  </w:num>
+  <w:num w:numId="5" w16cid:durableId="2141612344">
+    <w:abstractNumId w:val="26"/>
+  </w:num>
+  <w:num w:numId="6" w16cid:durableId="470758680">
+    <w:abstractNumId w:val="25"/>
+  </w:num>
+  <w:num w:numId="7" w16cid:durableId="835808136">
+    <w:abstractNumId w:val="21"/>
+  </w:num>
+  <w:num w:numId="8" w16cid:durableId="219638884">
+    <w:abstractNumId w:val="2"/>
+  </w:num>
+  <w:num w:numId="9" w16cid:durableId="636564921">
+    <w:abstractNumId w:val="17"/>
+  </w:num>
+  <w:num w:numId="10" w16cid:durableId="1259951033">
+    <w:abstractNumId w:val="24"/>
+  </w:num>
+  <w:num w:numId="11" w16cid:durableId="432481419">
+    <w:abstractNumId w:val="20"/>
+  </w:num>
+  <w:num w:numId="12" w16cid:durableId="950086783">
+    <w:abstractNumId w:val="3"/>
+  </w:num>
+  <w:num w:numId="13" w16cid:durableId="1143885885">
+    <w:abstractNumId w:val="30"/>
+  </w:num>
+  <w:num w:numId="14" w16cid:durableId="443766545">
+    <w:abstractNumId w:val="14"/>
+  </w:num>
+  <w:num w:numId="15" w16cid:durableId="788596117">
+    <w:abstractNumId w:val="7"/>
+  </w:num>
+  <w:num w:numId="16" w16cid:durableId="2054846393">
+    <w:abstractNumId w:val="27"/>
+  </w:num>
+  <w:num w:numId="17" w16cid:durableId="957488088">
+    <w:abstractNumId w:val="5"/>
+  </w:num>
+  <w:num w:numId="18" w16cid:durableId="135756873">
+    <w:abstractNumId w:val="29"/>
+  </w:num>
+  <w:num w:numId="19" w16cid:durableId="1150753843">
+    <w:abstractNumId w:val="22"/>
+  </w:num>
+  <w:num w:numId="20" w16cid:durableId="1415783301">
+    <w:abstractNumId w:val="1"/>
+  </w:num>
+  <w:num w:numId="21" w16cid:durableId="1326665298">
+    <w:abstractNumId w:val="9"/>
+  </w:num>
+  <w:num w:numId="22" w16cid:durableId="1729956343">
+    <w:abstractNumId w:val="10"/>
+  </w:num>
+  <w:num w:numId="23" w16cid:durableId="1374886770">
+    <w:abstractNumId w:val="4"/>
+  </w:num>
+  <w:num w:numId="24" w16cid:durableId="1775663943">
+    <w:abstractNumId w:val="12"/>
+  </w:num>
+  <w:num w:numId="25" w16cid:durableId="323242532">
+    <w:abstractNumId w:val="16"/>
+  </w:num>
+  <w:num w:numId="26" w16cid:durableId="1688369092">
+    <w:abstractNumId w:val="23"/>
+  </w:num>
+  <w:num w:numId="27" w16cid:durableId="1499999799">
+    <w:abstractNumId w:val="31"/>
+  </w:num>
+  <w:num w:numId="28" w16cid:durableId="1950889532">
+    <w:abstractNumId w:val="32"/>
+  </w:num>
+  <w:num w:numId="29" w16cid:durableId="1149446737">
+    <w:abstractNumId w:val="19"/>
+  </w:num>
+  <w:num w:numId="30" w16cid:durableId="1283418615">
     <w:abstractNumId w:val="6"/>
   </w:num>
-  <w:num w:numId="2" w16cid:durableId="418252928">
-    <w:abstractNumId w:val="14"/>
+  <w:num w:numId="31" w16cid:durableId="323631728">
+    <w:abstractNumId w:val="0"/>
   </w:num>
-  <w:num w:numId="3" w16cid:durableId="1015575208">
-    <w:abstractNumId w:val="23"/>
-  </w:num>
-  <w:num w:numId="4" w16cid:durableId="2000500593">
-    <w:abstractNumId w:val="11"/>
-  </w:num>
-  <w:num w:numId="5" w16cid:durableId="2141612344">
-    <w:abstractNumId w:val="21"/>
-  </w:num>
-  <w:num w:numId="6" w16cid:durableId="470758680">
-    <w:abstractNumId w:val="20"/>
-  </w:num>
-  <w:num w:numId="7" w16cid:durableId="835808136">
-    <w:abstractNumId w:val="16"/>
-  </w:num>
-  <w:num w:numId="8" w16cid:durableId="219638884">
-    <w:abstractNumId w:val="1"/>
-  </w:num>
-  <w:num w:numId="9" w16cid:durableId="636564921">
+  <w:num w:numId="32" w16cid:durableId="1472674380">
     <w:abstractNumId w:val="13"/>
   </w:num>
-  <w:num w:numId="10" w16cid:durableId="1259951033">
-    <w:abstractNumId w:val="19"/>
-  </w:num>
-  <w:num w:numId="11" w16cid:durableId="432481419">
-    <w:abstractNumId w:val="15"/>
-  </w:num>
-  <w:num w:numId="12" w16cid:durableId="950086783">
-    <w:abstractNumId w:val="2"/>
-  </w:num>
-  <w:num w:numId="13" w16cid:durableId="1143885885">
-    <w:abstractNumId w:val="25"/>
-  </w:num>
-  <w:num w:numId="14" w16cid:durableId="443766545">
-    <w:abstractNumId w:val="10"/>
-  </w:num>
-  <w:num w:numId="15" w16cid:durableId="788596117">
-    <w:abstractNumId w:val="5"/>
-  </w:num>
-  <w:num w:numId="16" w16cid:durableId="2054846393">
-    <w:abstractNumId w:val="22"/>
-  </w:num>
-  <w:num w:numId="17" w16cid:durableId="957488088">
-    <w:abstractNumId w:val="4"/>
-  </w:num>
-  <w:num w:numId="18" w16cid:durableId="135756873">
-    <w:abstractNumId w:val="24"/>
-  </w:num>
-  <w:num w:numId="19" w16cid:durableId="1150753843">
-    <w:abstractNumId w:val="17"/>
-  </w:num>
-  <w:num w:numId="20" w16cid:durableId="1415783301">
-    <w:abstractNumId w:val="0"/>
-  </w:num>
-  <w:num w:numId="21" w16cid:durableId="1326665298">
-    <w:abstractNumId w:val="7"/>
-  </w:num>
-  <w:num w:numId="22" w16cid:durableId="1729956343">
-    <w:abstractNumId w:val="8"/>
-  </w:num>
-  <w:num w:numId="23" w16cid:durableId="1374886770">
-    <w:abstractNumId w:val="3"/>
-  </w:num>
-  <w:num w:numId="24" w16cid:durableId="1775663943">
-    <w:abstractNumId w:val="9"/>
-  </w:num>
-  <w:num w:numId="25" w16cid:durableId="323242532">
-    <w:abstractNumId w:val="12"/>
-  </w:num>
-  <w:num w:numId="26" w16cid:durableId="1688369092">
-    <w:abstractNumId w:val="18"/>
-  </w:num>
-  <w:num w:numId="27" w16cid:durableId="1499999799">
-    <w:abstractNumId w:val="26"/>
+  <w:num w:numId="33" w16cid:durableId="289434309">
+    <w:abstractNumId w:val="11"/>
   </w:num>
 </w:numbering>
 </file>

</xml_diff>